<commit_message>
court(massappct): opening-brief docx regenerated from its current layout (fb-595.54.68)
Co-Authored-By: Claude Opus 5.5 <noreply@anthropic.com>
</commit_message>
<xml_diff>
--- a/courts/first-circuit/massachusetts/state/appeals-court/opening-brief/usage/OUTPUT-opening-brief.docx
+++ b/courts/first-circuit/massachusetts/state/appeals-court/opening-brief/usage/OUTPUT-opening-brief.docx
@@ -2454,7 +2454,7 @@
         <w:tab/>
       </w:r>
       <w:r>
-        <w:t xml:space="preserve">77</w:t>
+        <w:t xml:space="preserve">78</w:t>
       </w:r>
     </w:p>
     <w:p>
@@ -14460,567 +14460,6 @@
         <w:t xml:space="preserve">COMPLIANCE</w:t>
       </w:r>
     </w:p>
-    <w:p>
-      <w:pPr>
-        <w:spacing w:before="0" w:after="0" w:line="644" w:lineRule="exact"/>
-        <w:ind w:left="0" w:firstLine="720"/>
-        <w:jc w:val="left"/>
-      </w:pPr>
-      <w:r>
-        <w:t xml:space="preserve">I,</w:t>
-      </w:r>
-      <w:r>
-        <w:t xml:space="preserve"> </w:t>
-      </w:r>
-      <w:r>
-        <w:t xml:space="preserve">Gabriel</w:t>
-      </w:r>
-      <w:r>
-        <w:t xml:space="preserve"> </w:t>
-      </w:r>
-      <w:r>
-        <w:t xml:space="preserve">L.</w:t>
-      </w:r>
-      <w:r>
-        <w:t xml:space="preserve"> </w:t>
-      </w:r>
-      <w:r>
-        <w:t xml:space="preserve">Fonseca,</w:t>
-      </w:r>
-      <w:r>
-        <w:t xml:space="preserve"> </w:t>
-      </w:r>
-      <w:r>
-        <w:t xml:space="preserve">Esq.,</w:t>
-      </w:r>
-      <w:r>
-        <w:t xml:space="preserve"> </w:t>
-      </w:r>
-      <w:r>
-        <w:t xml:space="preserve">certify</w:t>
-      </w:r>
-      <w:r>
-        <w:t xml:space="preserve"> </w:t>
-      </w:r>
-      <w:r>
-        <w:t xml:space="preserve">that</w:t>
-      </w:r>
-      <w:r>
-        <w:t xml:space="preserve"> </w:t>
-      </w:r>
-      <w:r>
-        <w:t xml:space="preserve">the</w:t>
-      </w:r>
-      <w:r>
-        <w:t xml:space="preserve"> </w:t>
-      </w:r>
-      <w:r>
-        <w:t xml:space="preserve">brief</w:t>
-      </w:r>
-      <w:r>
-        <w:t xml:space="preserve"> </w:t>
-      </w:r>
-      <w:r>
-        <w:t xml:space="preserve">complies</w:t>
-      </w:r>
-      <w:r>
-        <w:t xml:space="preserve"> </w:t>
-      </w:r>
-      <w:r>
-        <w:t xml:space="preserve">with</w:t>
-      </w:r>
-      <w:r>
-        <w:t xml:space="preserve"> </w:t>
-      </w:r>
-      <w:r>
-        <w:t xml:space="preserve">the</w:t>
-      </w:r>
-      <w:r>
-        <w:t xml:space="preserve"> </w:t>
-      </w:r>
-      <w:r>
-        <w:t xml:space="preserve">rules</w:t>
-      </w:r>
-      <w:r>
-        <w:t xml:space="preserve"> </w:t>
-      </w:r>
-      <w:r>
-        <w:t xml:space="preserve">of</w:t>
-      </w:r>
-      <w:r>
-        <w:t xml:space="preserve"> </w:t>
-      </w:r>
-      <w:r>
-        <w:t xml:space="preserve">court</w:t>
-      </w:r>
-      <w:r>
-        <w:t xml:space="preserve"> </w:t>
-      </w:r>
-      <w:r>
-        <w:t xml:space="preserve">that</w:t>
-      </w:r>
-      <w:r>
-        <w:t xml:space="preserve"> </w:t>
-      </w:r>
-      <w:r>
-        <w:t xml:space="preserve">pertain</w:t>
-      </w:r>
-      <w:r>
-        <w:t xml:space="preserve"> </w:t>
-      </w:r>
-      <w:r>
-        <w:t xml:space="preserve">to</w:t>
-      </w:r>
-      <w:r>
-        <w:t xml:space="preserve"> </w:t>
-      </w:r>
-      <w:r>
-        <w:t xml:space="preserve">the</w:t>
-      </w:r>
-      <w:r>
-        <w:t xml:space="preserve"> </w:t>
-      </w:r>
-      <w:r>
-        <w:t xml:space="preserve">filing</w:t>
-      </w:r>
-      <w:r>
-        <w:t xml:space="preserve"> </w:t>
-      </w:r>
-      <w:r>
-        <w:t xml:space="preserve">of</w:t>
-      </w:r>
-      <w:r>
-        <w:t xml:space="preserve"> </w:t>
-      </w:r>
-      <w:r>
-        <w:t xml:space="preserve">briefs,</w:t>
-      </w:r>
-      <w:r>
-        <w:t xml:space="preserve"> </w:t>
-      </w:r>
-      <w:r>
-        <w:t xml:space="preserve">including,</w:t>
-      </w:r>
-      <w:r>
-        <w:t xml:space="preserve"> </w:t>
-      </w:r>
-      <w:r>
-        <w:t xml:space="preserve">but</w:t>
-      </w:r>
-      <w:r>
-        <w:t xml:space="preserve"> </w:t>
-      </w:r>
-      <w:r>
-        <w:t xml:space="preserve">not</w:t>
-      </w:r>
-      <w:r>
-        <w:t xml:space="preserve"> </w:t>
-      </w:r>
-      <w:r>
-        <w:t xml:space="preserve">limited</w:t>
-      </w:r>
-      <w:r>
-        <w:t xml:space="preserve"> </w:t>
-      </w:r>
-      <w:r>
-        <w:t xml:space="preserve">to:</w:t>
-      </w:r>
-      <w:r>
-        <w:t xml:space="preserve"> </w:t>
-      </w:r>
-      <w:r>
-        <w:t xml:space="preserve">Rule</w:t>
-      </w:r>
-      <w:r>
-        <w:t xml:space="preserve"> </w:t>
-      </w:r>
-      <w:r>
-        <w:t xml:space="preserve">16(a)⁠(13)</w:t>
-      </w:r>
-      <w:r>
-        <w:t xml:space="preserve"> </w:t>
-      </w:r>
-      <w:r>
-        <w:t xml:space="preserve">(addendum);</w:t>
-      </w:r>
-      <w:r>
-        <w:t xml:space="preserve"> </w:t>
-      </w:r>
-      <w:r>
-        <w:t xml:space="preserve">Rule</w:t>
-      </w:r>
-      <w:r>
-        <w:t xml:space="preserve"> </w:t>
-      </w:r>
-      <w:r>
-        <w:t xml:space="preserve">16(e)</w:t>
-      </w:r>
-      <w:r>
-        <w:t xml:space="preserve"> </w:t>
-      </w:r>
-      <w:r>
-        <w:t xml:space="preserve">(references</w:t>
-      </w:r>
-      <w:r>
-        <w:t xml:space="preserve"> </w:t>
-      </w:r>
-      <w:r>
-        <w:t xml:space="preserve">to</w:t>
-      </w:r>
-      <w:r>
-        <w:t xml:space="preserve"> </w:t>
-      </w:r>
-      <w:r>
-        <w:t xml:space="preserve">the</w:t>
-      </w:r>
-      <w:r>
-        <w:t xml:space="preserve"> </w:t>
-      </w:r>
-      <w:r>
-        <w:t xml:space="preserve">record);</w:t>
-      </w:r>
-      <w:r>
-        <w:t xml:space="preserve"> </w:t>
-      </w:r>
-      <w:r>
-        <w:t xml:space="preserve">Rule</w:t>
-      </w:r>
-      <w:r>
-        <w:t xml:space="preserve"> </w:t>
-      </w:r>
-      <w:r>
-        <w:t xml:space="preserve">18</w:t>
-      </w:r>
-      <w:r>
-        <w:t xml:space="preserve"> </w:t>
-      </w:r>
-      <w:r>
-        <w:t xml:space="preserve">(appendix</w:t>
-      </w:r>
-      <w:r>
-        <w:t xml:space="preserve"> </w:t>
-      </w:r>
-      <w:r>
-        <w:t xml:space="preserve">to</w:t>
-      </w:r>
-      <w:r>
-        <w:t xml:space="preserve"> </w:t>
-      </w:r>
-      <w:r>
-        <w:t xml:space="preserve">the</w:t>
-      </w:r>
-      <w:r>
-        <w:t xml:space="preserve"> </w:t>
-      </w:r>
-      <w:r>
-        <w:t xml:space="preserve">briefs);</w:t>
-      </w:r>
-      <w:r>
-        <w:t xml:space="preserve"> </w:t>
-      </w:r>
-      <w:r>
-        <w:t xml:space="preserve">Rule</w:t>
-      </w:r>
-      <w:r>
-        <w:t xml:space="preserve"> </w:t>
-      </w:r>
-      <w:r>
-        <w:t xml:space="preserve">20</w:t>
-      </w:r>
-      <w:r>
-        <w:t xml:space="preserve"> </w:t>
-      </w:r>
-      <w:r>
-        <w:t xml:space="preserve">(form</w:t>
-      </w:r>
-      <w:r>
-        <w:t xml:space="preserve"> </w:t>
-      </w:r>
-      <w:r>
-        <w:t xml:space="preserve">and</w:t>
-      </w:r>
-      <w:r>
-        <w:t xml:space="preserve"> </w:t>
-      </w:r>
-      <w:r>
-        <w:t xml:space="preserve">length</w:t>
-      </w:r>
-      <w:r>
-        <w:t xml:space="preserve"> </w:t>
-      </w:r>
-      <w:r>
-        <w:t xml:space="preserve">of</w:t>
-      </w:r>
-      <w:r>
-        <w:t xml:space="preserve"> </w:t>
-      </w:r>
-      <w:r>
-        <w:t xml:space="preserve">briefs,</w:t>
-      </w:r>
-      <w:r>
-        <w:t xml:space="preserve"> </w:t>
-      </w:r>
-      <w:r>
-        <w:t xml:space="preserve">appendices,</w:t>
-      </w:r>
-      <w:r>
-        <w:t xml:space="preserve"> </w:t>
-      </w:r>
-      <w:r>
-        <w:t xml:space="preserve">and</w:t>
-      </w:r>
-      <w:r>
-        <w:t xml:space="preserve"> </w:t>
-      </w:r>
-      <w:r>
-        <w:t xml:space="preserve">other</w:t>
-      </w:r>
-      <w:r>
-        <w:t xml:space="preserve"> </w:t>
-      </w:r>
-      <w:r>
-        <w:t xml:space="preserve">documents);</w:t>
-      </w:r>
-      <w:r>
-        <w:t xml:space="preserve"> </w:t>
-      </w:r>
-      <w:r>
-        <w:t xml:space="preserve">and</w:t>
-      </w:r>
-      <w:r>
-        <w:t xml:space="preserve"> </w:t>
-      </w:r>
-      <w:r>
-        <w:t xml:space="preserve">Rule</w:t>
-      </w:r>
-      <w:r>
-        <w:t xml:space="preserve"> </w:t>
-      </w:r>
-      <w:r>
-        <w:t xml:space="preserve">21</w:t>
-      </w:r>
-      <w:r>
-        <w:t xml:space="preserve"> </w:t>
-      </w:r>
-      <w:r>
-        <w:t xml:space="preserve">(redaction).</w:t>
-      </w:r>
-      <w:r>
-        <w:t xml:space="preserve"> </w:t>
-      </w:r>
-      <w:r>
-        <w:t xml:space="preserve">Compliance</w:t>
-      </w:r>
-      <w:r>
-        <w:t xml:space="preserve"> </w:t>
-      </w:r>
-      <w:r>
-        <w:t xml:space="preserve">with</w:t>
-      </w:r>
-      <w:r>
-        <w:t xml:space="preserve"> </w:t>
-      </w:r>
-      <w:r>
-        <w:t xml:space="preserve">Rule</w:t>
-      </w:r>
-      <w:r>
-        <w:t xml:space="preserve"> </w:t>
-      </w:r>
-      <w:r>
-        <w:t xml:space="preserve">20</w:t>
-      </w:r>
-      <w:r>
-        <w:t xml:space="preserve"> </w:t>
-      </w:r>
-      <w:r>
-        <w:t xml:space="preserve">was</w:t>
-      </w:r>
-      <w:r>
-        <w:t xml:space="preserve"> </w:t>
-      </w:r>
-      <w:r>
-        <w:t xml:space="preserve">achieved</w:t>
-      </w:r>
-      <w:r>
-        <w:t xml:space="preserve"> </w:t>
-      </w:r>
-      <w:r>
-        <w:t xml:space="preserve">by</w:t>
-      </w:r>
-      <w:r>
-        <w:t xml:space="preserve"> </w:t>
-      </w:r>
-      <w:r>
-        <w:t xml:space="preserve">using</w:t>
-      </w:r>
-      <w:r>
-        <w:t xml:space="preserve"> </w:t>
-      </w:r>
-      <w:r>
-        <w:t xml:space="preserve">Times</w:t>
-      </w:r>
-      <w:r>
-        <w:t xml:space="preserve"> </w:t>
-      </w:r>
-      <w:r>
-        <w:t xml:space="preserve">New</w:t>
-      </w:r>
-      <w:r>
-        <w:t xml:space="preserve"> </w:t>
-      </w:r>
-      <w:r>
-        <w:t xml:space="preserve">Roman</w:t>
-      </w:r>
-      <w:r>
-        <w:t xml:space="preserve"> </w:t>
-      </w:r>
-      <w:r>
-        <w:t xml:space="preserve">font</w:t>
-      </w:r>
-      <w:r>
-        <w:t xml:space="preserve"> </w:t>
-      </w:r>
-      <w:r>
-        <w:t xml:space="preserve">in</w:t>
-      </w:r>
-      <w:r>
-        <w:t xml:space="preserve"> </w:t>
-      </w:r>
-      <w:r>
-        <w:t xml:space="preserve">14-point</w:t>
-      </w:r>
-      <w:r>
-        <w:t xml:space="preserve"> </w:t>
-      </w:r>
-      <w:r>
-        <w:t xml:space="preserve">size.</w:t>
-      </w:r>
-      <w:r>
-        <w:t xml:space="preserve"> </w:t>
-      </w:r>
-      <w:r>
-        <w:t xml:space="preserve">The</w:t>
-      </w:r>
-      <w:r>
-        <w:t xml:space="preserve"> </w:t>
-      </w:r>
-      <w:r>
-        <w:t xml:space="preserve">number</w:t>
-      </w:r>
-      <w:r>
-        <w:t xml:space="preserve"> </w:t>
-      </w:r>
-      <w:r>
-        <w:t xml:space="preserve">of</w:t>
-      </w:r>
-      <w:r>
-        <w:t xml:space="preserve"> </w:t>
-      </w:r>
-      <w:r>
-        <w:t xml:space="preserve">non-excluded</w:t>
-      </w:r>
-      <w:r>
-        <w:t xml:space="preserve"> </w:t>
-      </w:r>
-      <w:r>
-        <w:t xml:space="preserve">words</w:t>
-      </w:r>
-      <w:r>
-        <w:t xml:space="preserve"> </w:t>
-      </w:r>
-      <w:r>
-        <w:t xml:space="preserve">of</w:t>
-      </w:r>
-      <w:r>
-        <w:t xml:space="preserve"> </w:t>
-      </w:r>
-      <w:r>
-        <w:t xml:space="preserve">this</w:t>
-      </w:r>
-      <w:r>
-        <w:t xml:space="preserve"> </w:t>
-      </w:r>
-      <w:r>
-        <w:t xml:space="preserve">brief</w:t>
-      </w:r>
-      <w:r>
-        <w:t xml:space="preserve"> </w:t>
-      </w:r>
-      <w:r>
-        <w:t xml:space="preserve">total</w:t>
-      </w:r>
-      <w:r>
-        <w:t xml:space="preserve"> </w:t>
-      </w:r>
-      <w:r>
-        <w:t xml:space="preserve">4653.</w:t>
-      </w:r>
-      <w:r>
-        <w:t xml:space="preserve"> </w:t>
-      </w:r>
-      <w:r>
-        <w:t xml:space="preserve">The</w:t>
-      </w:r>
-      <w:r>
-        <w:t xml:space="preserve"> </w:t>
-      </w:r>
-      <w:r>
-        <w:t xml:space="preserve">word</w:t>
-      </w:r>
-      <w:r>
-        <w:t xml:space="preserve"> </w:t>
-      </w:r>
-      <w:r>
-        <w:t xml:space="preserve">processing</w:t>
-      </w:r>
-      <w:r>
-        <w:t xml:space="preserve"> </w:t>
-      </w:r>
-      <w:r>
-        <w:t xml:space="preserve">system</w:t>
-      </w:r>
-      <w:r>
-        <w:t xml:space="preserve"> </w:t>
-      </w:r>
-      <w:r>
-        <w:t xml:space="preserve">used</w:t>
-      </w:r>
-      <w:r>
-        <w:t xml:space="preserve"> </w:t>
-      </w:r>
-      <w:r>
-        <w:t xml:space="preserve">was</w:t>
-      </w:r>
-      <w:r>
-        <w:t xml:space="preserve"> </w:t>
-      </w:r>
-      <w:r>
-        <w:t xml:space="preserve">Microsoft</w:t>
-      </w:r>
-      <w:r>
-        <w:t xml:space="preserve"> </w:t>
-      </w:r>
-      <w:r>
-        <w:t xml:space="preserve">Word,</w:t>
-      </w:r>
-      <w:r>
-        <w:t xml:space="preserve"> </w:t>
-      </w:r>
-      <w:r>
-        <w:t xml:space="preserve">Version</w:t>
-      </w:r>
-      <w:r>
-        <w:t xml:space="preserve"> </w:t>
-      </w:r>
-      <w:r>
-        <w:t xml:space="preserve">2021.</w:t>
-      </w:r>
-    </w:p>
-    <w:p>
-      <w:pPr>
-        <w:spacing w:before="0" w:after="0" w:line="112" w:lineRule="exact"/>
-      </w:pPr>
-    </w:p>
     <w:tbl>
       <w:tblPr>
         <w:tblW w:w="9360" w:type="dxa"/>
@@ -15046,7 +14485,563 @@
           </w:tcPr>
           <w:p>
             <w:pPr>
-              <w:spacing w:before="0" w:after="0" w:line="322" w:lineRule="exact"/>
+              <w:spacing w:before="0" w:after="0" w:line="644" w:lineRule="exact"/>
+              <w:ind w:left="0" w:firstLine="720"/>
+              <w:jc w:val="left"/>
+            </w:pPr>
+            <w:r>
+              <w:t xml:space="preserve">I,</w:t>
+            </w:r>
+            <w:r>
+              <w:t xml:space="preserve"> </w:t>
+            </w:r>
+            <w:r>
+              <w:t xml:space="preserve">Gabriel</w:t>
+            </w:r>
+            <w:r>
+              <w:t xml:space="preserve"> </w:t>
+            </w:r>
+            <w:r>
+              <w:t xml:space="preserve">L.</w:t>
+            </w:r>
+            <w:r>
+              <w:t xml:space="preserve"> </w:t>
+            </w:r>
+            <w:r>
+              <w:t xml:space="preserve">Fonseca,</w:t>
+            </w:r>
+            <w:r>
+              <w:t xml:space="preserve"> </w:t>
+            </w:r>
+            <w:r>
+              <w:t xml:space="preserve">Esq.,</w:t>
+            </w:r>
+            <w:r>
+              <w:t xml:space="preserve"> </w:t>
+            </w:r>
+            <w:r>
+              <w:t xml:space="preserve">certify</w:t>
+            </w:r>
+            <w:r>
+              <w:t xml:space="preserve"> </w:t>
+            </w:r>
+            <w:r>
+              <w:t xml:space="preserve">that</w:t>
+            </w:r>
+            <w:r>
+              <w:t xml:space="preserve"> </w:t>
+            </w:r>
+            <w:r>
+              <w:t xml:space="preserve">the</w:t>
+            </w:r>
+            <w:r>
+              <w:t xml:space="preserve"> </w:t>
+            </w:r>
+            <w:r>
+              <w:t xml:space="preserve">brief</w:t>
+            </w:r>
+            <w:r>
+              <w:t xml:space="preserve"> </w:t>
+            </w:r>
+            <w:r>
+              <w:t xml:space="preserve">complies</w:t>
+            </w:r>
+            <w:r>
+              <w:t xml:space="preserve"> </w:t>
+            </w:r>
+            <w:r>
+              <w:t xml:space="preserve">with</w:t>
+            </w:r>
+            <w:r>
+              <w:t xml:space="preserve"> </w:t>
+            </w:r>
+            <w:r>
+              <w:t xml:space="preserve">the</w:t>
+            </w:r>
+            <w:r>
+              <w:t xml:space="preserve"> </w:t>
+            </w:r>
+            <w:r>
+              <w:t xml:space="preserve">rules</w:t>
+            </w:r>
+            <w:r>
+              <w:t xml:space="preserve"> </w:t>
+            </w:r>
+            <w:r>
+              <w:t xml:space="preserve">of</w:t>
+            </w:r>
+            <w:r>
+              <w:t xml:space="preserve"> </w:t>
+            </w:r>
+            <w:r>
+              <w:t xml:space="preserve">court</w:t>
+            </w:r>
+            <w:r>
+              <w:t xml:space="preserve"> </w:t>
+            </w:r>
+            <w:r>
+              <w:t xml:space="preserve">that</w:t>
+            </w:r>
+            <w:r>
+              <w:t xml:space="preserve"> </w:t>
+            </w:r>
+            <w:r>
+              <w:t xml:space="preserve">pertain</w:t>
+            </w:r>
+            <w:r>
+              <w:t xml:space="preserve"> </w:t>
+            </w:r>
+            <w:r>
+              <w:t xml:space="preserve">to</w:t>
+            </w:r>
+            <w:r>
+              <w:t xml:space="preserve"> </w:t>
+            </w:r>
+            <w:r>
+              <w:t xml:space="preserve">the</w:t>
+            </w:r>
+            <w:r>
+              <w:t xml:space="preserve"> </w:t>
+            </w:r>
+            <w:r>
+              <w:t xml:space="preserve">filing</w:t>
+            </w:r>
+            <w:r>
+              <w:t xml:space="preserve"> </w:t>
+            </w:r>
+            <w:r>
+              <w:t xml:space="preserve">of</w:t>
+            </w:r>
+            <w:r>
+              <w:t xml:space="preserve"> </w:t>
+            </w:r>
+            <w:r>
+              <w:t xml:space="preserve">briefs,</w:t>
+            </w:r>
+            <w:r>
+              <w:t xml:space="preserve"> </w:t>
+            </w:r>
+            <w:r>
+              <w:t xml:space="preserve">including,</w:t>
+            </w:r>
+            <w:r>
+              <w:t xml:space="preserve"> </w:t>
+            </w:r>
+            <w:r>
+              <w:t xml:space="preserve">but</w:t>
+            </w:r>
+            <w:r>
+              <w:t xml:space="preserve"> </w:t>
+            </w:r>
+            <w:r>
+              <w:t xml:space="preserve">not</w:t>
+            </w:r>
+            <w:r>
+              <w:t xml:space="preserve"> </w:t>
+            </w:r>
+            <w:r>
+              <w:t xml:space="preserve">limited</w:t>
+            </w:r>
+            <w:r>
+              <w:t xml:space="preserve"> </w:t>
+            </w:r>
+            <w:r>
+              <w:t xml:space="preserve">to:</w:t>
+            </w:r>
+            <w:r>
+              <w:t xml:space="preserve"> </w:t>
+            </w:r>
+            <w:r>
+              <w:t xml:space="preserve">Rule</w:t>
+            </w:r>
+            <w:r>
+              <w:t xml:space="preserve"> </w:t>
+            </w:r>
+            <w:r>
+              <w:t xml:space="preserve">16(a)⁠(13)</w:t>
+            </w:r>
+            <w:r>
+              <w:t xml:space="preserve"> </w:t>
+            </w:r>
+            <w:r>
+              <w:t xml:space="preserve">(addendum);</w:t>
+            </w:r>
+            <w:r>
+              <w:t xml:space="preserve"> </w:t>
+            </w:r>
+            <w:r>
+              <w:t xml:space="preserve">Rule</w:t>
+            </w:r>
+            <w:r>
+              <w:t xml:space="preserve"> </w:t>
+            </w:r>
+            <w:r>
+              <w:t xml:space="preserve">16(e)</w:t>
+            </w:r>
+            <w:r>
+              <w:t xml:space="preserve"> </w:t>
+            </w:r>
+            <w:r>
+              <w:t xml:space="preserve">(references</w:t>
+            </w:r>
+            <w:r>
+              <w:t xml:space="preserve"> </w:t>
+            </w:r>
+            <w:r>
+              <w:t xml:space="preserve">to</w:t>
+            </w:r>
+            <w:r>
+              <w:t xml:space="preserve"> </w:t>
+            </w:r>
+            <w:r>
+              <w:t xml:space="preserve">the</w:t>
+            </w:r>
+            <w:r>
+              <w:t xml:space="preserve"> </w:t>
+            </w:r>
+            <w:r>
+              <w:t xml:space="preserve">record);</w:t>
+            </w:r>
+            <w:r>
+              <w:t xml:space="preserve"> </w:t>
+            </w:r>
+            <w:r>
+              <w:t xml:space="preserve">Rule</w:t>
+            </w:r>
+            <w:r>
+              <w:t xml:space="preserve"> </w:t>
+            </w:r>
+            <w:r>
+              <w:t xml:space="preserve">18</w:t>
+            </w:r>
+            <w:r>
+              <w:t xml:space="preserve"> </w:t>
+            </w:r>
+            <w:r>
+              <w:t xml:space="preserve">(appendix</w:t>
+            </w:r>
+            <w:r>
+              <w:t xml:space="preserve"> </w:t>
+            </w:r>
+            <w:r>
+              <w:t xml:space="preserve">to</w:t>
+            </w:r>
+            <w:r>
+              <w:t xml:space="preserve"> </w:t>
+            </w:r>
+            <w:r>
+              <w:t xml:space="preserve">the</w:t>
+            </w:r>
+            <w:r>
+              <w:t xml:space="preserve"> </w:t>
+            </w:r>
+            <w:r>
+              <w:t xml:space="preserve">briefs);</w:t>
+            </w:r>
+            <w:r>
+              <w:t xml:space="preserve"> </w:t>
+            </w:r>
+            <w:r>
+              <w:t xml:space="preserve">Rule</w:t>
+            </w:r>
+            <w:r>
+              <w:t xml:space="preserve"> </w:t>
+            </w:r>
+            <w:r>
+              <w:t xml:space="preserve">20</w:t>
+            </w:r>
+            <w:r>
+              <w:t xml:space="preserve"> </w:t>
+            </w:r>
+            <w:r>
+              <w:t xml:space="preserve">(form</w:t>
+            </w:r>
+            <w:r>
+              <w:t xml:space="preserve"> </w:t>
+            </w:r>
+            <w:r>
+              <w:t xml:space="preserve">and</w:t>
+            </w:r>
+            <w:r>
+              <w:t xml:space="preserve"> </w:t>
+            </w:r>
+            <w:r>
+              <w:t xml:space="preserve">length</w:t>
+            </w:r>
+            <w:r>
+              <w:t xml:space="preserve"> </w:t>
+            </w:r>
+            <w:r>
+              <w:t xml:space="preserve">of</w:t>
+            </w:r>
+            <w:r>
+              <w:t xml:space="preserve"> </w:t>
+            </w:r>
+            <w:r>
+              <w:t xml:space="preserve">briefs,</w:t>
+            </w:r>
+            <w:r>
+              <w:t xml:space="preserve"> </w:t>
+            </w:r>
+            <w:r>
+              <w:t xml:space="preserve">appendices,</w:t>
+            </w:r>
+            <w:r>
+              <w:t xml:space="preserve"> </w:t>
+            </w:r>
+            <w:r>
+              <w:t xml:space="preserve">and</w:t>
+            </w:r>
+            <w:r>
+              <w:t xml:space="preserve"> </w:t>
+            </w:r>
+            <w:r>
+              <w:t xml:space="preserve">other</w:t>
+            </w:r>
+            <w:r>
+              <w:t xml:space="preserve"> </w:t>
+            </w:r>
+            <w:r>
+              <w:t xml:space="preserve">documents);</w:t>
+            </w:r>
+            <w:r>
+              <w:t xml:space="preserve"> </w:t>
+            </w:r>
+            <w:r>
+              <w:t xml:space="preserve">and</w:t>
+            </w:r>
+            <w:r>
+              <w:t xml:space="preserve"> </w:t>
+            </w:r>
+            <w:r>
+              <w:t xml:space="preserve">Rule</w:t>
+            </w:r>
+            <w:r>
+              <w:t xml:space="preserve"> </w:t>
+            </w:r>
+            <w:r>
+              <w:t xml:space="preserve">21</w:t>
+            </w:r>
+            <w:r>
+              <w:t xml:space="preserve"> </w:t>
+            </w:r>
+            <w:r>
+              <w:t xml:space="preserve">(redaction).</w:t>
+            </w:r>
+            <w:r>
+              <w:t xml:space="preserve"> </w:t>
+            </w:r>
+            <w:r>
+              <w:t xml:space="preserve">Compliance</w:t>
+            </w:r>
+            <w:r>
+              <w:t xml:space="preserve"> </w:t>
+            </w:r>
+            <w:r>
+              <w:t xml:space="preserve">with</w:t>
+            </w:r>
+            <w:r>
+              <w:t xml:space="preserve"> </w:t>
+            </w:r>
+            <w:r>
+              <w:t xml:space="preserve">Rule</w:t>
+            </w:r>
+            <w:r>
+              <w:t xml:space="preserve"> </w:t>
+            </w:r>
+            <w:r>
+              <w:t xml:space="preserve">20</w:t>
+            </w:r>
+            <w:r>
+              <w:t xml:space="preserve"> </w:t>
+            </w:r>
+            <w:r>
+              <w:t xml:space="preserve">was</w:t>
+            </w:r>
+            <w:r>
+              <w:t xml:space="preserve"> </w:t>
+            </w:r>
+            <w:r>
+              <w:t xml:space="preserve">achieved</w:t>
+            </w:r>
+            <w:r>
+              <w:t xml:space="preserve"> </w:t>
+            </w:r>
+            <w:r>
+              <w:t xml:space="preserve">by</w:t>
+            </w:r>
+            <w:r>
+              <w:t xml:space="preserve"> </w:t>
+            </w:r>
+            <w:r>
+              <w:t xml:space="preserve">using</w:t>
+            </w:r>
+            <w:r>
+              <w:t xml:space="preserve"> </w:t>
+            </w:r>
+            <w:r>
+              <w:t xml:space="preserve">Times</w:t>
+            </w:r>
+            <w:r>
+              <w:t xml:space="preserve"> </w:t>
+            </w:r>
+            <w:r>
+              <w:t xml:space="preserve">New</w:t>
+            </w:r>
+            <w:r>
+              <w:t xml:space="preserve"> </w:t>
+            </w:r>
+            <w:r>
+              <w:t xml:space="preserve">Roman</w:t>
+            </w:r>
+            <w:r>
+              <w:t xml:space="preserve"> </w:t>
+            </w:r>
+            <w:r>
+              <w:t xml:space="preserve">font</w:t>
+            </w:r>
+            <w:r>
+              <w:t xml:space="preserve"> </w:t>
+            </w:r>
+            <w:r>
+              <w:t xml:space="preserve">in</w:t>
+            </w:r>
+            <w:r>
+              <w:t xml:space="preserve"> </w:t>
+            </w:r>
+            <w:r>
+              <w:t xml:space="preserve">14-point</w:t>
+            </w:r>
+            <w:r>
+              <w:t xml:space="preserve"> </w:t>
+            </w:r>
+            <w:r>
+              <w:t xml:space="preserve">size.</w:t>
+            </w:r>
+            <w:r>
+              <w:t xml:space="preserve"> </w:t>
+            </w:r>
+            <w:r>
+              <w:t xml:space="preserve">The</w:t>
+            </w:r>
+            <w:r>
+              <w:t xml:space="preserve"> </w:t>
+            </w:r>
+            <w:r>
+              <w:t xml:space="preserve">number</w:t>
+            </w:r>
+            <w:r>
+              <w:t xml:space="preserve"> </w:t>
+            </w:r>
+            <w:r>
+              <w:t xml:space="preserve">of</w:t>
+            </w:r>
+            <w:r>
+              <w:t xml:space="preserve"> </w:t>
+            </w:r>
+            <w:r>
+              <w:t xml:space="preserve">non-excluded</w:t>
+            </w:r>
+            <w:r>
+              <w:t xml:space="preserve"> </w:t>
+            </w:r>
+            <w:r>
+              <w:t xml:space="preserve">words</w:t>
+            </w:r>
+            <w:r>
+              <w:t xml:space="preserve"> </w:t>
+            </w:r>
+            <w:r>
+              <w:t xml:space="preserve">of</w:t>
+            </w:r>
+            <w:r>
+              <w:t xml:space="preserve"> </w:t>
+            </w:r>
+            <w:r>
+              <w:t xml:space="preserve">this</w:t>
+            </w:r>
+            <w:r>
+              <w:t xml:space="preserve"> </w:t>
+            </w:r>
+            <w:r>
+              <w:t xml:space="preserve">brief</w:t>
+            </w:r>
+            <w:r>
+              <w:t xml:space="preserve"> </w:t>
+            </w:r>
+            <w:r>
+              <w:t xml:space="preserve">total</w:t>
+            </w:r>
+            <w:r>
+              <w:t xml:space="preserve"> </w:t>
+            </w:r>
+            <w:r>
+              <w:t xml:space="preserve">4653.</w:t>
+            </w:r>
+            <w:r>
+              <w:t xml:space="preserve"> </w:t>
+            </w:r>
+            <w:r>
+              <w:t xml:space="preserve">The</w:t>
+            </w:r>
+            <w:r>
+              <w:t xml:space="preserve"> </w:t>
+            </w:r>
+            <w:r>
+              <w:t xml:space="preserve">word</w:t>
+            </w:r>
+            <w:r>
+              <w:t xml:space="preserve"> </w:t>
+            </w:r>
+            <w:r>
+              <w:t xml:space="preserve">processing</w:t>
+            </w:r>
+            <w:r>
+              <w:t xml:space="preserve"> </w:t>
+            </w:r>
+            <w:r>
+              <w:t xml:space="preserve">system</w:t>
+            </w:r>
+            <w:r>
+              <w:t xml:space="preserve"> </w:t>
+            </w:r>
+            <w:r>
+              <w:t xml:space="preserve">used</w:t>
+            </w:r>
+            <w:r>
+              <w:t xml:space="preserve"> </w:t>
+            </w:r>
+            <w:r>
+              <w:t xml:space="preserve">was</w:t>
+            </w:r>
+            <w:r>
+              <w:t xml:space="preserve"> </w:t>
+            </w:r>
+            <w:r>
+              <w:t xml:space="preserve">Microsoft</w:t>
+            </w:r>
+            <w:r>
+              <w:t xml:space="preserve"> </w:t>
+            </w:r>
+            <w:r>
+              <w:t xml:space="preserve">Word,</w:t>
+            </w:r>
+            <w:r>
+              <w:t xml:space="preserve"> </w:t>
+            </w:r>
+            <w:r>
+              <w:t xml:space="preserve">Version</w:t>
+            </w:r>
+            <w:r>
+              <w:t xml:space="preserve"> </w:t>
+            </w:r>
+            <w:r>
+              <w:t xml:space="preserve">2021.</w:t>
+            </w:r>
+          </w:p>
+          <w:p>
+            <w:pPr>
+              <w:spacing w:before="112" w:after="0" w:line="322" w:lineRule="exact"/>
               <w:ind w:left="4608" w:firstLine="0"/>
               <w:jc w:val="left"/>
             </w:pPr>
@@ -15303,497 +15298,6 @@
         </w:rPr>
         <w:t xml:space="preserve">SERVICE</w:t>
       </w:r>
-    </w:p>
-    <w:p>
-      <w:pPr>
-        <w:spacing w:before="0" w:after="0" w:line="644" w:lineRule="exact"/>
-        <w:ind w:left="0" w:firstLine="720"/>
-        <w:jc w:val="left"/>
-      </w:pPr>
-      <w:r>
-        <w:t xml:space="preserve">I,</w:t>
-      </w:r>
-      <w:r>
-        <w:t xml:space="preserve"> </w:t>
-      </w:r>
-      <w:r>
-        <w:t xml:space="preserve">Gabriel</w:t>
-      </w:r>
-      <w:r>
-        <w:t xml:space="preserve"> </w:t>
-      </w:r>
-      <w:r>
-        <w:t xml:space="preserve">L.</w:t>
-      </w:r>
-      <w:r>
-        <w:t xml:space="preserve"> </w:t>
-      </w:r>
-      <w:r>
-        <w:t xml:space="preserve">Fonseca,</w:t>
-      </w:r>
-      <w:r>
-        <w:t xml:space="preserve"> </w:t>
-      </w:r>
-      <w:r>
-        <w:t xml:space="preserve">Esq.,</w:t>
-      </w:r>
-      <w:r>
-        <w:t xml:space="preserve"> </w:t>
-      </w:r>
-      <w:r>
-        <w:t xml:space="preserve">certify</w:t>
-      </w:r>
-      <w:r>
-        <w:t xml:space="preserve"> </w:t>
-      </w:r>
-      <w:r>
-        <w:t xml:space="preserve">that</w:t>
-      </w:r>
-      <w:r>
-        <w:t xml:space="preserve"> </w:t>
-      </w:r>
-      <w:r>
-        <w:t xml:space="preserve">on</w:t>
-      </w:r>
-      <w:r>
-        <w:t xml:space="preserve"> </w:t>
-      </w:r>
-      <w:r>
-        <w:t xml:space="preserve">behalf</w:t>
-      </w:r>
-      <w:r>
-        <w:t xml:space="preserve"> </w:t>
-      </w:r>
-      <w:r>
-        <w:t xml:space="preserve">of</w:t>
-      </w:r>
-      <w:r>
-        <w:t xml:space="preserve"> </w:t>
-      </w:r>
-      <w:r>
-        <w:t xml:space="preserve">Appellant</w:t>
-      </w:r>
-      <w:r>
-        <w:t xml:space="preserve"> </w:t>
-      </w:r>
-      <w:r>
-        <w:t xml:space="preserve">Laural</w:t>
-      </w:r>
-      <w:r>
-        <w:t xml:space="preserve"> </w:t>
-      </w:r>
-      <w:r>
-        <w:t xml:space="preserve">Charland,</w:t>
-      </w:r>
-      <w:r>
-        <w:t xml:space="preserve"> </w:t>
-      </w:r>
-      <w:r>
-        <w:t xml:space="preserve">I</w:t>
-      </w:r>
-      <w:r>
-        <w:t xml:space="preserve"> </w:t>
-      </w:r>
-      <w:r>
-        <w:t xml:space="preserve">served</w:t>
-      </w:r>
-      <w:r>
-        <w:t xml:space="preserve"> </w:t>
-      </w:r>
-      <w:r>
-        <w:t xml:space="preserve">this</w:t>
-      </w:r>
-      <w:r>
-        <w:t xml:space="preserve"> </w:t>
-      </w:r>
-      <w:r>
-        <w:t xml:space="preserve">Appellant’s</w:t>
-      </w:r>
-      <w:r>
-        <w:t xml:space="preserve"> </w:t>
-      </w:r>
-      <w:r>
-        <w:t xml:space="preserve">Brief</w:t>
-      </w:r>
-      <w:r>
-        <w:t xml:space="preserve"> </w:t>
-      </w:r>
-      <w:r>
-        <w:t xml:space="preserve">and</w:t>
-      </w:r>
-      <w:r>
-        <w:t xml:space="preserve"> </w:t>
-      </w:r>
-      <w:r>
-        <w:t xml:space="preserve">Record</w:t>
-      </w:r>
-      <w:r>
-        <w:t xml:space="preserve"> </w:t>
-      </w:r>
-      <w:r>
-        <w:t xml:space="preserve">Appendix</w:t>
-      </w:r>
-      <w:r>
-        <w:t xml:space="preserve"> </w:t>
-      </w:r>
-      <w:r>
-        <w:t xml:space="preserve">for</w:t>
-      </w:r>
-      <w:r>
-        <w:t xml:space="preserve"> </w:t>
-      </w:r>
-      <w:r>
-        <w:t xml:space="preserve">Appeals</w:t>
-      </w:r>
-      <w:r>
-        <w:t xml:space="preserve"> </w:t>
-      </w:r>
-      <w:r>
-        <w:t xml:space="preserve">Court</w:t>
-      </w:r>
-      <w:r>
-        <w:t xml:space="preserve"> </w:t>
-      </w:r>
-      <w:r>
-        <w:t xml:space="preserve">case</w:t>
-      </w:r>
-      <w:r>
-        <w:t xml:space="preserve"> </w:t>
-      </w:r>
-      <w:r>
-        <w:t xml:space="preserve">No.</w:t>
-      </w:r>
-      <w:r>
-        <w:t xml:space="preserve"> </w:t>
-      </w:r>
-      <w:r>
-        <w:t xml:space="preserve">2022-P</w:t>
-        <w:noBreakHyphen/>
-        <w:t xml:space="preserve">0300,</w:t>
-      </w:r>
-      <w:r>
-        <w:t xml:space="preserve"> </w:t>
-      </w:r>
-      <w:r>
-        <w:t xml:space="preserve">Cassandra</w:t>
-      </w:r>
-      <w:r>
-        <w:t xml:space="preserve"> </w:t>
-      </w:r>
-      <w:r>
-        <w:t xml:space="preserve">Ferreira</w:t>
-      </w:r>
-      <w:r>
-        <w:t xml:space="preserve"> </w:t>
-      </w:r>
-      <w:r>
-        <w:t xml:space="preserve">v.</w:t>
-      </w:r>
-      <w:r>
-        <w:t xml:space="preserve"> </w:t>
-      </w:r>
-      <w:r>
-        <w:t xml:space="preserve">Laural</w:t>
-      </w:r>
-      <w:r>
-        <w:t xml:space="preserve"> </w:t>
-      </w:r>
-      <w:r>
-        <w:t xml:space="preserve">Charland</w:t>
-      </w:r>
-      <w:r>
-        <w:t xml:space="preserve"> </w:t>
-      </w:r>
-      <w:r>
-        <w:t xml:space="preserve">&amp;</w:t>
-      </w:r>
-      <w:r>
-        <w:t xml:space="preserve"> </w:t>
-      </w:r>
-      <w:r>
-        <w:t xml:space="preserve">Others,</w:t>
-      </w:r>
-      <w:r>
-        <w:t xml:space="preserve"> </w:t>
-      </w:r>
-      <w:r>
-        <w:t xml:space="preserve">on</w:t>
-      </w:r>
-      <w:r>
-        <w:t xml:space="preserve"> </w:t>
-      </w:r>
-      <w:r>
-        <w:t xml:space="preserve">Ms.</w:t>
-      </w:r>
-      <w:r>
-        <w:t xml:space="preserve"> </w:t>
-      </w:r>
-      <w:r>
-        <w:t xml:space="preserve">Ferreira’s</w:t>
-      </w:r>
-      <w:r>
-        <w:t xml:space="preserve"> </w:t>
-      </w:r>
-      <w:r>
-        <w:t xml:space="preserve">Attorney</w:t>
-      </w:r>
-      <w:r>
-        <w:t xml:space="preserve"> </w:t>
-      </w:r>
-      <w:r>
-        <w:t xml:space="preserve">Lawrence</w:t>
-      </w:r>
-      <w:r>
-        <w:t xml:space="preserve"> </w:t>
-      </w:r>
-      <w:r>
-        <w:t xml:space="preserve">Farber,</w:t>
-      </w:r>
-      <w:r>
-        <w:t xml:space="preserve"> </w:t>
-      </w:r>
-      <w:r>
-        <w:t xml:space="preserve">Esq.,</w:t>
-      </w:r>
-      <w:r>
-        <w:t xml:space="preserve"> </w:t>
-      </w:r>
-      <w:r>
-        <w:t xml:space="preserve">Farber</w:t>
-      </w:r>
-      <w:r>
-        <w:t xml:space="preserve"> </w:t>
-      </w:r>
-      <w:r>
-        <w:t xml:space="preserve">and</w:t>
-      </w:r>
-      <w:r>
-        <w:t xml:space="preserve"> </w:t>
-      </w:r>
-      <w:r>
-        <w:t xml:space="preserve">Lindley,</w:t>
-      </w:r>
-      <w:r>
-        <w:t xml:space="preserve"> </w:t>
-      </w:r>
-      <w:r>
-        <w:t xml:space="preserve">LLC,</w:t>
-      </w:r>
-      <w:r>
-        <w:t xml:space="preserve"> </w:t>
-      </w:r>
-      <w:r>
-        <w:t xml:space="preserve">30</w:t>
-      </w:r>
-      <w:r>
-        <w:t xml:space="preserve"> </w:t>
-      </w:r>
-      <w:r>
-        <w:t xml:space="preserve">Boltwood</w:t>
-      </w:r>
-      <w:r>
-        <w:t xml:space="preserve"> </w:t>
-      </w:r>
-      <w:r>
-        <w:t xml:space="preserve">Walk,</w:t>
-      </w:r>
-      <w:r>
-        <w:t xml:space="preserve"> </w:t>
-      </w:r>
-      <w:r>
-        <w:t xml:space="preserve">Front</w:t>
-      </w:r>
-      <w:r>
-        <w:t xml:space="preserve"> </w:t>
-      </w:r>
-      <w:r>
-        <w:t xml:space="preserve">101,</w:t>
-      </w:r>
-      <w:r>
-        <w:t xml:space="preserve"> </w:t>
-      </w:r>
-      <w:r>
-        <w:t xml:space="preserve">Amherst,</w:t>
-      </w:r>
-      <w:r>
-        <w:t xml:space="preserve"> </w:t>
-      </w:r>
-      <w:r>
-        <w:t xml:space="preserve">MA</w:t>
-      </w:r>
-      <w:r>
-        <w:t xml:space="preserve"> </w:t>
-      </w:r>
-      <w:r>
-        <w:t xml:space="preserve">01002,</w:t>
-      </w:r>
-      <w:r>
-        <w:t xml:space="preserve"> </w:t>
-      </w:r>
-      <w:r>
-        <w:t xml:space="preserve">via</w:t>
-      </w:r>
-      <w:r>
-        <w:t xml:space="preserve"> </w:t>
-      </w:r>
-      <w:r>
-        <w:t xml:space="preserve">electronic</w:t>
-      </w:r>
-      <w:r>
-        <w:t xml:space="preserve"> </w:t>
-      </w:r>
-      <w:r>
-        <w:t xml:space="preserve">service</w:t>
-      </w:r>
-      <w:r>
-        <w:t xml:space="preserve"> </w:t>
-      </w:r>
-      <w:r>
-        <w:t xml:space="preserve">on</w:t>
-      </w:r>
-      <w:r>
-        <w:t xml:space="preserve"> </w:t>
-      </w:r>
-      <w:r>
-        <w:t xml:space="preserve">May</w:t>
-      </w:r>
-      <w:r>
-        <w:t xml:space="preserve"> </w:t>
-      </w:r>
-      <w:r>
-        <w:t xml:space="preserve">16,</w:t>
-      </w:r>
-      <w:r>
-        <w:t xml:space="preserve"> </w:t>
-      </w:r>
-      <w:r>
-        <w:t xml:space="preserve">2022;</w:t>
-      </w:r>
-      <w:r>
-        <w:t xml:space="preserve"> </w:t>
-      </w:r>
-      <w:r>
-        <w:t xml:space="preserve">I</w:t>
-      </w:r>
-      <w:r>
-        <w:t xml:space="preserve"> </w:t>
-      </w:r>
-      <w:r>
-        <w:t xml:space="preserve">served</w:t>
-      </w:r>
-      <w:r>
-        <w:t xml:space="preserve"> </w:t>
-      </w:r>
-      <w:r>
-        <w:t xml:space="preserve">copies</w:t>
-      </w:r>
-      <w:r>
-        <w:t xml:space="preserve"> </w:t>
-      </w:r>
-      <w:r>
-        <w:t xml:space="preserve">of</w:t>
-      </w:r>
-      <w:r>
-        <w:t xml:space="preserve"> </w:t>
-      </w:r>
-      <w:r>
-        <w:t xml:space="preserve">same</w:t>
-      </w:r>
-      <w:r>
-        <w:t xml:space="preserve"> </w:t>
-      </w:r>
-      <w:r>
-        <w:t xml:space="preserve">on</w:t>
-      </w:r>
-      <w:r>
-        <w:t xml:space="preserve"> </w:t>
-      </w:r>
-      <w:r>
-        <w:t xml:space="preserve">Defendants</w:t>
-      </w:r>
-      <w:r>
-        <w:t xml:space="preserve"> </w:t>
-      </w:r>
-      <w:r>
-        <w:t xml:space="preserve">Jason</w:t>
-      </w:r>
-      <w:r>
-        <w:t xml:space="preserve"> </w:t>
-      </w:r>
-      <w:r>
-        <w:t xml:space="preserve">Charland</w:t>
-      </w:r>
-      <w:r>
-        <w:t xml:space="preserve"> </w:t>
-      </w:r>
-      <w:r>
-        <w:t xml:space="preserve">and</w:t>
-      </w:r>
-      <w:r>
-        <w:t xml:space="preserve"> </w:t>
-      </w:r>
-      <w:r>
-        <w:t xml:space="preserve">James</w:t>
-      </w:r>
-      <w:r>
-        <w:t xml:space="preserve"> </w:t>
-      </w:r>
-      <w:r>
-        <w:t xml:space="preserve">Vazquez</w:t>
-      </w:r>
-      <w:r>
-        <w:t xml:space="preserve"> </w:t>
-      </w:r>
-      <w:r>
-        <w:t xml:space="preserve">by</w:t>
-      </w:r>
-      <w:r>
-        <w:t xml:space="preserve"> </w:t>
-      </w:r>
-      <w:r>
-        <w:t xml:space="preserve">first</w:t>
-      </w:r>
-      <w:r>
-        <w:t xml:space="preserve"> </w:t>
-      </w:r>
-      <w:r>
-        <w:t xml:space="preserve">class</w:t>
-      </w:r>
-      <w:r>
-        <w:t xml:space="preserve"> </w:t>
-      </w:r>
-      <w:r>
-        <w:t xml:space="preserve">mail</w:t>
-      </w:r>
-      <w:r>
-        <w:t xml:space="preserve"> </w:t>
-      </w:r>
-      <w:r>
-        <w:t xml:space="preserve">on</w:t>
-      </w:r>
-      <w:r>
-        <w:t xml:space="preserve"> </w:t>
-      </w:r>
-      <w:r>
-        <w:t xml:space="preserve">May</w:t>
-      </w:r>
-      <w:r>
-        <w:t xml:space="preserve"> </w:t>
-      </w:r>
-      <w:r>
-        <w:t xml:space="preserve">16,</w:t>
-      </w:r>
-      <w:r>
-        <w:t xml:space="preserve"> </w:t>
-      </w:r>
-      <w:r>
-        <w:t xml:space="preserve">2022.</w:t>
-      </w:r>
-    </w:p>
-    <w:p>
-      <w:pPr>
-        <w:spacing w:before="0" w:after="0" w:line="112" w:lineRule="exact"/>
-      </w:pPr>
     </w:p>
     <w:tbl>
       <w:tblPr>
@@ -15820,7 +15324,493 @@
           </w:tcPr>
           <w:p>
             <w:pPr>
-              <w:spacing w:before="0" w:after="0" w:line="322" w:lineRule="exact"/>
+              <w:spacing w:before="0" w:after="0" w:line="644" w:lineRule="exact"/>
+              <w:ind w:left="0" w:firstLine="720"/>
+              <w:jc w:val="left"/>
+            </w:pPr>
+            <w:r>
+              <w:t xml:space="preserve">I,</w:t>
+            </w:r>
+            <w:r>
+              <w:t xml:space="preserve"> </w:t>
+            </w:r>
+            <w:r>
+              <w:t xml:space="preserve">Gabriel</w:t>
+            </w:r>
+            <w:r>
+              <w:t xml:space="preserve"> </w:t>
+            </w:r>
+            <w:r>
+              <w:t xml:space="preserve">L.</w:t>
+            </w:r>
+            <w:r>
+              <w:t xml:space="preserve"> </w:t>
+            </w:r>
+            <w:r>
+              <w:t xml:space="preserve">Fonseca,</w:t>
+            </w:r>
+            <w:r>
+              <w:t xml:space="preserve"> </w:t>
+            </w:r>
+            <w:r>
+              <w:t xml:space="preserve">Esq.,</w:t>
+            </w:r>
+            <w:r>
+              <w:t xml:space="preserve"> </w:t>
+            </w:r>
+            <w:r>
+              <w:t xml:space="preserve">certify</w:t>
+            </w:r>
+            <w:r>
+              <w:t xml:space="preserve"> </w:t>
+            </w:r>
+            <w:r>
+              <w:t xml:space="preserve">that</w:t>
+            </w:r>
+            <w:r>
+              <w:t xml:space="preserve"> </w:t>
+            </w:r>
+            <w:r>
+              <w:t xml:space="preserve">on</w:t>
+            </w:r>
+            <w:r>
+              <w:t xml:space="preserve"> </w:t>
+            </w:r>
+            <w:r>
+              <w:t xml:space="preserve">behalf</w:t>
+            </w:r>
+            <w:r>
+              <w:t xml:space="preserve"> </w:t>
+            </w:r>
+            <w:r>
+              <w:t xml:space="preserve">of</w:t>
+            </w:r>
+            <w:r>
+              <w:t xml:space="preserve"> </w:t>
+            </w:r>
+            <w:r>
+              <w:t xml:space="preserve">Appellant</w:t>
+            </w:r>
+            <w:r>
+              <w:t xml:space="preserve"> </w:t>
+            </w:r>
+            <w:r>
+              <w:t xml:space="preserve">Laural</w:t>
+            </w:r>
+            <w:r>
+              <w:t xml:space="preserve"> </w:t>
+            </w:r>
+            <w:r>
+              <w:t xml:space="preserve">Charland,</w:t>
+            </w:r>
+            <w:r>
+              <w:t xml:space="preserve"> </w:t>
+            </w:r>
+            <w:r>
+              <w:t xml:space="preserve">I</w:t>
+            </w:r>
+            <w:r>
+              <w:t xml:space="preserve"> </w:t>
+            </w:r>
+            <w:r>
+              <w:t xml:space="preserve">served</w:t>
+            </w:r>
+            <w:r>
+              <w:t xml:space="preserve"> </w:t>
+            </w:r>
+            <w:r>
+              <w:t xml:space="preserve">this</w:t>
+            </w:r>
+            <w:r>
+              <w:t xml:space="preserve"> </w:t>
+            </w:r>
+            <w:r>
+              <w:t xml:space="preserve">Appellant’s</w:t>
+            </w:r>
+            <w:r>
+              <w:t xml:space="preserve"> </w:t>
+            </w:r>
+            <w:r>
+              <w:t xml:space="preserve">Brief</w:t>
+            </w:r>
+            <w:r>
+              <w:t xml:space="preserve"> </w:t>
+            </w:r>
+            <w:r>
+              <w:t xml:space="preserve">and</w:t>
+            </w:r>
+            <w:r>
+              <w:t xml:space="preserve"> </w:t>
+            </w:r>
+            <w:r>
+              <w:t xml:space="preserve">Record</w:t>
+            </w:r>
+            <w:r>
+              <w:t xml:space="preserve"> </w:t>
+            </w:r>
+            <w:r>
+              <w:t xml:space="preserve">Appendix</w:t>
+            </w:r>
+            <w:r>
+              <w:t xml:space="preserve"> </w:t>
+            </w:r>
+            <w:r>
+              <w:t xml:space="preserve">for</w:t>
+            </w:r>
+            <w:r>
+              <w:t xml:space="preserve"> </w:t>
+            </w:r>
+            <w:r>
+              <w:t xml:space="preserve">Appeals</w:t>
+            </w:r>
+            <w:r>
+              <w:t xml:space="preserve"> </w:t>
+            </w:r>
+            <w:r>
+              <w:t xml:space="preserve">Court</w:t>
+            </w:r>
+            <w:r>
+              <w:t xml:space="preserve"> </w:t>
+            </w:r>
+            <w:r>
+              <w:t xml:space="preserve">case</w:t>
+            </w:r>
+            <w:r>
+              <w:t xml:space="preserve"> </w:t>
+            </w:r>
+            <w:r>
+              <w:t xml:space="preserve">No.</w:t>
+            </w:r>
+            <w:r>
+              <w:t xml:space="preserve"> </w:t>
+            </w:r>
+            <w:r>
+              <w:t xml:space="preserve">2022-P</w:t>
+              <w:noBreakHyphen/>
+              <w:t xml:space="preserve">0300,</w:t>
+            </w:r>
+            <w:r>
+              <w:t xml:space="preserve"> </w:t>
+            </w:r>
+            <w:r>
+              <w:t xml:space="preserve">Cassandra</w:t>
+            </w:r>
+            <w:r>
+              <w:t xml:space="preserve"> </w:t>
+            </w:r>
+            <w:r>
+              <w:t xml:space="preserve">Ferreira</w:t>
+            </w:r>
+            <w:r>
+              <w:t xml:space="preserve"> </w:t>
+            </w:r>
+            <w:r>
+              <w:t xml:space="preserve">v.</w:t>
+            </w:r>
+            <w:r>
+              <w:t xml:space="preserve"> </w:t>
+            </w:r>
+            <w:r>
+              <w:t xml:space="preserve">Laural</w:t>
+            </w:r>
+            <w:r>
+              <w:t xml:space="preserve"> </w:t>
+            </w:r>
+            <w:r>
+              <w:t xml:space="preserve">Charland</w:t>
+            </w:r>
+            <w:r>
+              <w:t xml:space="preserve"> </w:t>
+            </w:r>
+            <w:r>
+              <w:t xml:space="preserve">&amp;</w:t>
+            </w:r>
+            <w:r>
+              <w:t xml:space="preserve"> </w:t>
+            </w:r>
+            <w:r>
+              <w:t xml:space="preserve">Others,</w:t>
+            </w:r>
+            <w:r>
+              <w:t xml:space="preserve"> </w:t>
+            </w:r>
+            <w:r>
+              <w:t xml:space="preserve">on</w:t>
+            </w:r>
+            <w:r>
+              <w:t xml:space="preserve"> </w:t>
+            </w:r>
+            <w:r>
+              <w:t xml:space="preserve">Ms.</w:t>
+            </w:r>
+            <w:r>
+              <w:t xml:space="preserve"> </w:t>
+            </w:r>
+            <w:r>
+              <w:t xml:space="preserve">Ferreira’s</w:t>
+            </w:r>
+            <w:r>
+              <w:t xml:space="preserve"> </w:t>
+            </w:r>
+            <w:r>
+              <w:t xml:space="preserve">Attorney</w:t>
+            </w:r>
+            <w:r>
+              <w:t xml:space="preserve"> </w:t>
+            </w:r>
+            <w:r>
+              <w:t xml:space="preserve">Lawrence</w:t>
+            </w:r>
+            <w:r>
+              <w:t xml:space="preserve"> </w:t>
+            </w:r>
+            <w:r>
+              <w:t xml:space="preserve">Farber,</w:t>
+            </w:r>
+            <w:r>
+              <w:t xml:space="preserve"> </w:t>
+            </w:r>
+            <w:r>
+              <w:t xml:space="preserve">Esq.,</w:t>
+            </w:r>
+            <w:r>
+              <w:t xml:space="preserve"> </w:t>
+            </w:r>
+            <w:r>
+              <w:t xml:space="preserve">Farber</w:t>
+            </w:r>
+            <w:r>
+              <w:t xml:space="preserve"> </w:t>
+            </w:r>
+            <w:r>
+              <w:t xml:space="preserve">and</w:t>
+            </w:r>
+            <w:r>
+              <w:t xml:space="preserve"> </w:t>
+            </w:r>
+            <w:r>
+              <w:t xml:space="preserve">Lindley,</w:t>
+            </w:r>
+            <w:r>
+              <w:t xml:space="preserve"> </w:t>
+            </w:r>
+            <w:r>
+              <w:t xml:space="preserve">LLC,</w:t>
+            </w:r>
+            <w:r>
+              <w:t xml:space="preserve"> </w:t>
+            </w:r>
+            <w:r>
+              <w:t xml:space="preserve">30</w:t>
+            </w:r>
+            <w:r>
+              <w:t xml:space="preserve"> </w:t>
+            </w:r>
+            <w:r>
+              <w:t xml:space="preserve">Boltwood</w:t>
+            </w:r>
+            <w:r>
+              <w:t xml:space="preserve"> </w:t>
+            </w:r>
+            <w:r>
+              <w:t xml:space="preserve">Walk,</w:t>
+            </w:r>
+            <w:r>
+              <w:t xml:space="preserve"> </w:t>
+            </w:r>
+            <w:r>
+              <w:t xml:space="preserve">Front</w:t>
+            </w:r>
+            <w:r>
+              <w:t xml:space="preserve"> </w:t>
+            </w:r>
+            <w:r>
+              <w:t xml:space="preserve">101,</w:t>
+            </w:r>
+            <w:r>
+              <w:t xml:space="preserve"> </w:t>
+            </w:r>
+            <w:r>
+              <w:t xml:space="preserve">Amherst,</w:t>
+            </w:r>
+            <w:r>
+              <w:t xml:space="preserve"> </w:t>
+            </w:r>
+            <w:r>
+              <w:t xml:space="preserve">MA</w:t>
+            </w:r>
+            <w:r>
+              <w:t xml:space="preserve"> </w:t>
+            </w:r>
+            <w:r>
+              <w:t xml:space="preserve">01002,</w:t>
+            </w:r>
+            <w:r>
+              <w:t xml:space="preserve"> </w:t>
+            </w:r>
+            <w:r>
+              <w:t xml:space="preserve">via</w:t>
+            </w:r>
+            <w:r>
+              <w:t xml:space="preserve"> </w:t>
+            </w:r>
+            <w:r>
+              <w:t xml:space="preserve">electronic</w:t>
+            </w:r>
+            <w:r>
+              <w:t xml:space="preserve"> </w:t>
+            </w:r>
+            <w:r>
+              <w:t xml:space="preserve">service</w:t>
+            </w:r>
+            <w:r>
+              <w:t xml:space="preserve"> </w:t>
+            </w:r>
+            <w:r>
+              <w:t xml:space="preserve">on</w:t>
+            </w:r>
+            <w:r>
+              <w:t xml:space="preserve"> </w:t>
+            </w:r>
+            <w:r>
+              <w:t xml:space="preserve">May</w:t>
+            </w:r>
+            <w:r>
+              <w:t xml:space="preserve"> </w:t>
+            </w:r>
+            <w:r>
+              <w:t xml:space="preserve">16,</w:t>
+            </w:r>
+            <w:r>
+              <w:t xml:space="preserve"> </w:t>
+            </w:r>
+            <w:r>
+              <w:t xml:space="preserve">2022;</w:t>
+            </w:r>
+            <w:r>
+              <w:t xml:space="preserve"> </w:t>
+            </w:r>
+            <w:r>
+              <w:t xml:space="preserve">I</w:t>
+            </w:r>
+            <w:r>
+              <w:t xml:space="preserve"> </w:t>
+            </w:r>
+            <w:r>
+              <w:t xml:space="preserve">served</w:t>
+            </w:r>
+            <w:r>
+              <w:t xml:space="preserve"> </w:t>
+            </w:r>
+            <w:r>
+              <w:t xml:space="preserve">copies</w:t>
+            </w:r>
+            <w:r>
+              <w:t xml:space="preserve"> </w:t>
+            </w:r>
+            <w:r>
+              <w:t xml:space="preserve">of</w:t>
+            </w:r>
+            <w:r>
+              <w:t xml:space="preserve"> </w:t>
+            </w:r>
+            <w:r>
+              <w:t xml:space="preserve">same</w:t>
+            </w:r>
+            <w:r>
+              <w:t xml:space="preserve"> </w:t>
+            </w:r>
+            <w:r>
+              <w:t xml:space="preserve">on</w:t>
+            </w:r>
+            <w:r>
+              <w:t xml:space="preserve"> </w:t>
+            </w:r>
+            <w:r>
+              <w:t xml:space="preserve">Defendants</w:t>
+            </w:r>
+            <w:r>
+              <w:t xml:space="preserve"> </w:t>
+            </w:r>
+            <w:r>
+              <w:t xml:space="preserve">Jason</w:t>
+            </w:r>
+            <w:r>
+              <w:t xml:space="preserve"> </w:t>
+            </w:r>
+            <w:r>
+              <w:t xml:space="preserve">Charland</w:t>
+            </w:r>
+            <w:r>
+              <w:t xml:space="preserve"> </w:t>
+            </w:r>
+            <w:r>
+              <w:t xml:space="preserve">and</w:t>
+            </w:r>
+            <w:r>
+              <w:t xml:space="preserve"> </w:t>
+            </w:r>
+            <w:r>
+              <w:t xml:space="preserve">James</w:t>
+            </w:r>
+            <w:r>
+              <w:t xml:space="preserve"> </w:t>
+            </w:r>
+            <w:r>
+              <w:t xml:space="preserve">Vazquez</w:t>
+            </w:r>
+            <w:r>
+              <w:t xml:space="preserve"> </w:t>
+            </w:r>
+            <w:r>
+              <w:t xml:space="preserve">by</w:t>
+            </w:r>
+            <w:r>
+              <w:t xml:space="preserve"> </w:t>
+            </w:r>
+            <w:r>
+              <w:t xml:space="preserve">first</w:t>
+            </w:r>
+            <w:r>
+              <w:t xml:space="preserve"> </w:t>
+            </w:r>
+            <w:r>
+              <w:t xml:space="preserve">class</w:t>
+            </w:r>
+            <w:r>
+              <w:t xml:space="preserve"> </w:t>
+            </w:r>
+            <w:r>
+              <w:t xml:space="preserve">mail</w:t>
+            </w:r>
+            <w:r>
+              <w:t xml:space="preserve"> </w:t>
+            </w:r>
+            <w:r>
+              <w:t xml:space="preserve">on</w:t>
+            </w:r>
+            <w:r>
+              <w:t xml:space="preserve"> </w:t>
+            </w:r>
+            <w:r>
+              <w:t xml:space="preserve">May</w:t>
+            </w:r>
+            <w:r>
+              <w:t xml:space="preserve"> </w:t>
+            </w:r>
+            <w:r>
+              <w:t xml:space="preserve">16,</w:t>
+            </w:r>
+            <w:r>
+              <w:t xml:space="preserve"> </w:t>
+            </w:r>
+            <w:r>
+              <w:t xml:space="preserve">2022.</w:t>
+            </w:r>
+          </w:p>
+          <w:p>
+            <w:pPr>
+              <w:spacing w:before="112" w:after="0" w:line="322" w:lineRule="exact"/>
               <w:ind w:left="4608" w:firstLine="0"/>
               <w:jc w:val="left"/>
             </w:pPr>

</xml_diff>

<commit_message>
chore(eval): re-render docx of the Massachusetts Appeals Court briefs on the fixed Word page lookup (fb-595.54.82)
Co-Authored-By: Claude Opus 5.5 <noreply@anthropic.com>
</commit_message>
<xml_diff>
--- a/courts/first-circuit/massachusetts/state/appeals-court/opening-brief/usage/OUTPUT-opening-brief.docx
+++ b/courts/first-circuit/massachusetts/state/appeals-court/opening-brief/usage/OUTPUT-opening-brief.docx
@@ -9411,7 +9411,7 @@
         <w:t xml:space="preserve">&amp; Rehabilitation, P.C. v. Norfolk &amp; Dedham Group</w:t>
       </w:r>
       <w:r>
-        <w:t xml:space="preserve">, 469 Mass. 800, 805, 17 N.E.3d 1056 (2014) (“Under common-law principles of contract . . . a plaintiff may reject a defendant’s disputed tender of payment, made after the date for payment has expired, and litigate its breach of contract claim to completion.”). In</w:t>
+        <w:t xml:space="preserve">, 469 Mass. 800, 805, 17 N.E.3d 1056 (2014) (“Under common-law principles of contract ⁠. ⁠. ⁠. a plaintiff may reject a defendant’s disputed tender of payment, made after the date for payment has expired, and litigate its breach of contract claim to completion.”). In</w:t>
       </w:r>
       <w:r>
         <w:t xml:space="preserve"> </w:t>
@@ -9438,7 +9438,7 @@
         <w:t xml:space="preserve">Co. v. Gomez</w:t>
       </w:r>
       <w:r>
-        <w:t xml:space="preserve">, the United States Supreme Court held the following: When a plaintiff rejects such an offer – however good the terms – her interest in the lawsuit remains just what it was before. And so too does the court’s ability to grant her relief. An unaccepted settlement offer – like any unaccepted contract offer – is a legal nullity, with no operative effect . . . [s]o assuming the case was live before – because plaintiff had a stake and the court could grant relief – the litigation carries on, unmooted. 577 U.S. 153, 162, 136 S.Ct. 663, 670 (2016), citing</w:t>
+        <w:t xml:space="preserve">, the United States Supreme Court held the following: When a plaintiff rejects such an offer – however good the terms – her interest in the lawsuit remains just what it was before. And so too does the court’s ability to grant her relief. An unaccepted settlement offer – like any unaccepted contract offer – is a legal nullity, with no operative effect ⁠. ⁠. ⁠. [s]o assuming the case was live before – because plaintiff had a stake and the court could grant relief – the litigation carries on, unmooted. 577 U.S. 153, 162, 136 S.Ct. 663, 670 (2016), citing</w:t>
       </w:r>
       <w:r>
         <w:t xml:space="preserve"> </w:t>
@@ -14196,7 +14196,7 @@
         <w:noBreakHyphen/>
       </w:r>
       <w:r>
-        <w:t xml:space="preserve">181. Parties: PEDRO CRUZ, Plaintiff, v. VILMARY NORAT-REYES and SALVADOR MORENO, Defendants. Judge: /s/​Robert Fields, Associate Justice. Date: March 1, 2017. Western Division.</w:t>
+        <w:t xml:space="preserve">181. Parties: PEDRO CRUZ, Plaintiff, v. VILMARY NORAT-REYES and SALVADOR MORENO, Defendants. Judge: ⁠/s/​Robert Fields, Associate Justice. Date: March 1, 2017. Western Division.</w:t>
       </w:r>
     </w:p>
     <w:p>

</xml_diff>

<commit_message>
xdoc typst: an authority's page list wider than the line wraps in a column that leaves the citation its own width (up to half the line) and a leader; massappct opening-brief's § 8A row no longer set a word a line into its pages (DEF-FORM-004) (fb-595.87)
Co-Authored-By: Claude Opus 5.5 <noreply@anthropic.com>
Gate: run-1029014735-57659 7e84754cc84de04fb501d36311e95bdcc0c6cede
</commit_message>
<xml_diff>
--- a/courts/first-circuit/massachusetts/state/appeals-court/opening-brief/usage/OUTPUT-opening-brief.docx
+++ b/courts/first-circuit/massachusetts/state/appeals-court/opening-brief/usage/OUTPUT-opening-brief.docx
@@ -85,9 +85,7 @@
           <w:b/>
           <w:bCs/>
         </w:rPr>
-        <w:t xml:space="preserve">2022-P</w:t>
-        <w:noBreakHyphen/>
-        <w:t xml:space="preserve">0300</w:t>
+        <w:t xml:space="preserve">2022-P-⁠0300</w:t>
       </w:r>
     </w:p>
     <w:p>
@@ -599,11 +597,7 @@
         <w:t xml:space="preserve"> </w:t>
       </w:r>
       <w:r>
-        <w:t xml:space="preserve">413</w:t>
-        <w:noBreakHyphen/>
-        <w:t xml:space="preserve">686</w:t>
-        <w:noBreakHyphen/>
-        <w:t xml:space="preserve">9007</w:t>
+        <w:t xml:space="preserve">413-⁠686-⁠9007</w:t>
       </w:r>
     </w:p>
     <w:p>
@@ -2148,9 +2142,7 @@
         <w:t xml:space="preserve"> </w:t>
       </w:r>
       <w:r>
-        <w:t xml:space="preserve">20-SP</w:t>
-        <w:noBreakHyphen/>
-        <w:t xml:space="preserve">1676</w:t>
+        <w:t xml:space="preserve">20-SP-⁠1676</w:t>
       </w:r>
       <w:r>
         <w:t xml:space="preserve"> </w:t>
@@ -2357,9 +2349,7 @@
         <w:t xml:space="preserve"> </w:t>
       </w:r>
       <w:r>
-        <w:t xml:space="preserve">17-SP</w:t>
-        <w:noBreakHyphen/>
-        <w:t xml:space="preserve">181,</w:t>
+        <w:t xml:space="preserve">17-SP-⁠181,</w:t>
       </w:r>
       <w:r>
         <w:t xml:space="preserve"> </w:t>
@@ -3915,9 +3905,7 @@
         <w:t xml:space="preserve"> </w:t>
       </w:r>
       <w:r>
-        <w:t xml:space="preserve">17-SP</w:t>
-        <w:noBreakHyphen/>
-        <w:t xml:space="preserve">181,</w:t>
+        <w:t xml:space="preserve">17-SP-⁠181,</w:t>
       </w:r>
       <w:r>
         <w:t xml:space="preserve"> </w:t>
@@ -7051,25 +7039,13 @@
         <w:pStyle w:val="BodyText"/>
       </w:pPr>
       <w:r>
-        <w:t xml:space="preserve">The Landlord filed this summary process ‘no fault’ action against Ms. Charland and the other two tenants on December 14, 2020 based on a 30-Day Notice to Quit. Record Appendix (“R.A.”) at 4, 9</w:t>
-      </w:r>
-      <w:r>
-        <w:noBreakHyphen/>
-      </w:r>
-      <w:r>
-        <w:t xml:space="preserve">10. On March 2, 2021, Ms. Charland timely served and filed an Answer that raised, as a counterclaim, the Landlord’s violation of the water statute, G.L. c.186, §22.</w:t>
-      </w:r>
-      <w:r>
-        <w:t xml:space="preserve"> </w:t>
-      </w:r>
-      <w:r>
-        <w:t xml:space="preserve">R.A. at 5, 12</w:t>
-      </w:r>
-      <w:r>
-        <w:noBreakHyphen/>
-      </w:r>
-      <w:r>
-        <w:t xml:space="preserve">22. Under state law, such a counterclaim also operates as a defense to the Landlord’s claim for possession of the unit.</w:t>
+        <w:t xml:space="preserve">The Landlord filed this summary process ‘no fault’ action against Ms. Charland and the other two tenants on December 14, 2020 based on a 30-Day Notice to Quit. Record Appendix (“R.A.”) at 4, 9-⁠10. On March 2, 2021, Ms. Charland timely served and filed an Answer that raised, as a counterclaim, the Landlord’s violation of the water statute, G.L. c.186, §22.</w:t>
+      </w:r>
+      <w:r>
+        <w:t xml:space="preserve"> </w:t>
+      </w:r>
+      <w:r>
+        <w:t xml:space="preserve">R.A. at 5, 12-⁠22. Under state law, such a counterclaim also operates as a defense to the Landlord’s claim for possession of the unit.</w:t>
       </w:r>
     </w:p>
     <w:p>
@@ -7077,55 +7053,25 @@
         <w:pStyle w:val="BodyText"/>
       </w:pPr>
       <w:r>
-        <w:t xml:space="preserve">On June 21, 2021, Judge Robert G. Fields of the Western Division of the Housing Court (“Housing Court”) presided over a bench trial wherein Ms. Charland, through counsel, agreed to the Landlord’s prima facie case. R.A. at 33</w:t>
-      </w:r>
-      <w:r>
-        <w:noBreakHyphen/>
-      </w:r>
-      <w:r>
-        <w:t xml:space="preserve">34. The Landlord did not contest that she violated G. L. c.186, §22.</w:t>
-      </w:r>
-      <w:r>
-        <w:t xml:space="preserve"> </w:t>
-      </w:r>
-      <w:r>
-        <w:t xml:space="preserve">R.A. at 34</w:t>
-      </w:r>
-      <w:r>
-        <w:noBreakHyphen/>
-      </w:r>
-      <w:r>
-        <w:t xml:space="preserve">39. Instead, she argued that because she tendered payment to cure the violation prior to trial, Ms. Charland’s §8A</w:t>
-      </w:r>
-      <w:r>
-        <w:t xml:space="preserve"> </w:t>
-      </w:r>
-      <w:r>
-        <w:t xml:space="preserve">defense was moot or waived. R.A. at 34</w:t>
-      </w:r>
-      <w:r>
-        <w:noBreakHyphen/>
-      </w:r>
-      <w:r>
-        <w:t xml:space="preserve">39. Ms. Charland agreed that the Landlord sent payment but contested that such tender was accepted or was a mutual agreement to settle her counterclaim and §8A</w:t>
-      </w:r>
-      <w:r>
-        <w:t xml:space="preserve"> </w:t>
-      </w:r>
-      <w:r>
-        <w:t xml:space="preserve">defense. R.A. at 34</w:t>
-      </w:r>
-      <w:r>
-        <w:noBreakHyphen/>
-      </w:r>
-      <w:r>
-        <w:t xml:space="preserve">39. The Landlord offered no admissible evidence of any settlement, agreement, or even cancelled check to support its argument. R.A. at 34</w:t>
-      </w:r>
-      <w:r>
-        <w:noBreakHyphen/>
-      </w:r>
-      <w:r>
-        <w:t xml:space="preserve">42.</w:t>
+        <w:t xml:space="preserve">On June 21, 2021, Judge Robert G. Fields of the Western Division of the Housing Court (“Housing Court”) presided over a bench trial wherein Ms. Charland, through counsel, agreed to the Landlord’s prima facie case. R.A. at 33-⁠34. The Landlord did not contest that she violated G. L. c.186, §22.</w:t>
+      </w:r>
+      <w:r>
+        <w:t xml:space="preserve"> </w:t>
+      </w:r>
+      <w:r>
+        <w:t xml:space="preserve">R.A. at 34-⁠39. Instead, she argued that because she tendered payment to cure the violation prior to trial, Ms. Charland’s §8A</w:t>
+      </w:r>
+      <w:r>
+        <w:t xml:space="preserve"> </w:t>
+      </w:r>
+      <w:r>
+        <w:t xml:space="preserve">defense was moot or waived. R.A. at 34-⁠39. Ms. Charland agreed that the Landlord sent payment but contested that such tender was accepted or was a mutual agreement to settle her counterclaim and §8A</w:t>
+      </w:r>
+      <w:r>
+        <w:t xml:space="preserve"> </w:t>
+      </w:r>
+      <w:r>
+        <w:t xml:space="preserve">defense. R.A. at 34-⁠39. The Landlord offered no admissible evidence of any settlement, agreement, or even cancelled check to support its argument. R.A. at 34-⁠42.</w:t>
       </w:r>
     </w:p>
     <w:p>
@@ -7139,19 +7085,7 @@
         <w:t xml:space="preserve"> </w:t>
       </w:r>
       <w:r>
-        <w:t xml:space="preserve">R.A. at 26</w:t>
-      </w:r>
-      <w:r>
-        <w:noBreakHyphen/>
-      </w:r>
-      <w:r>
-        <w:t xml:space="preserve">28. The Court held the following: There is no question that the tenant asserted a claim that the landlord violated G.L. c.186, s.22 and there is no question that such claim triggers “violation of any other law” under G.L. c.239, s.8A. The question posed by this case is whether after the landlord tendered full compensation to the tenant for her claim under G.L. c.186, s.22 can she still assert said claim at trial to trigger the application of G.L. c.239, s.8A as a defense to possession. Given that the landlord tendered all the funds for the damages asserted under that claim and that they were knowingly accepted by the tenants without any reservation of rights, such tender and acceptance satisfied and resolved the tenants’ claim under G.L. c.186, s.22 and it can not be used to trigger a defense to possession under G.L. c.239, s.8A. R.A. at 26</w:t>
-      </w:r>
-      <w:r>
-        <w:noBreakHyphen/>
-      </w:r>
-      <w:r>
-        <w:t xml:space="preserve">27.</w:t>
+        <w:t xml:space="preserve">R.A. at 26-⁠28. The Court held the following: There is no question that the tenant asserted a claim that the landlord violated G.L. c.186, s.22 and there is no question that such claim triggers “violation of any other law” under G.L. c.239, s.8A. The question posed by this case is whether after the landlord tendered full compensation to the tenant for her claim under G.L. c.186, s.22 can she still assert said claim at trial to trigger the application of G.L. c.239, s.8A as a defense to possession. Given that the landlord tendered all the funds for the damages asserted under that claim and that they were knowingly accepted by the tenants without any reservation of rights, such tender and acceptance satisfied and resolved the tenants’ claim under G.L. c.186, s.22 and it can not be used to trigger a defense to possession under G.L. c.239, s.8A. R.A. at 26-⁠27.</w:t>
       </w:r>
     </w:p>
     <w:p>
@@ -7265,13 +7199,7 @@
         <w:pStyle w:val="BodyText"/>
       </w:pPr>
       <w:r>
-        <w:t xml:space="preserve">Ms. Charland resides at 51 Ray Street, Ludlow, MA, in a single-family home she rented from the Landlord beginning in 2016. R.A. at 61</w:t>
-      </w:r>
-      <w:r>
-        <w:noBreakHyphen/>
-      </w:r>
-      <w:r>
-        <w:t xml:space="preserve">62. Ms. Charland moved into the house with her brother Jason Charland and her partner James Vazquez, also named tenants. R.A. at 62.</w:t>
+        <w:t xml:space="preserve">Ms. Charland resides at 51 Ray Street, Ludlow, MA, in a single-family home she rented from the Landlord beginning in 2016. R.A. at 61-⁠62. Ms. Charland moved into the house with her brother Jason Charland and her partner James Vazquez, also named tenants. R.A. at 62.</w:t>
       </w:r>
     </w:p>
     <w:p>
@@ -7297,13 +7225,7 @@
         <w:t xml:space="preserve"> </w:t>
       </w:r>
       <w:r>
-        <w:t xml:space="preserve">even at trial. R.A. at 33</w:t>
-      </w:r>
-      <w:r>
-        <w:noBreakHyphen/>
-      </w:r>
-      <w:r>
-        <w:t xml:space="preserve">42.</w:t>
+        <w:t xml:space="preserve">even at trial. R.A. at 33-⁠42.</w:t>
       </w:r>
     </w:p>
     <w:p>
@@ -7311,19 +7233,7 @@
         <w:pStyle w:val="BodyText"/>
       </w:pPr>
       <w:r>
-        <w:t xml:space="preserve">Prior to trial, but after service of Ms. Charland’s Answer, the Landlord mailed several checks to Ms. Charland and to her counsel’s office to reimburse the Tenant for the illegal water charges and to pay damages. R.A. at 36</w:t>
-      </w:r>
-      <w:r>
-        <w:noBreakHyphen/>
-      </w:r>
-      <w:r>
-        <w:t xml:space="preserve">39. The record contained no evidence that the Landlord ever offered to settle Ms. Charland’s attorney’s fees. R.A. at 33</w:t>
-      </w:r>
-      <w:r>
-        <w:noBreakHyphen/>
-      </w:r>
-      <w:r>
-        <w:t xml:space="preserve">42.</w:t>
+        <w:t xml:space="preserve">Prior to trial, but after service of Ms. Charland’s Answer, the Landlord mailed several checks to Ms. Charland and to her counsel’s office to reimburse the Tenant for the illegal water charges and to pay damages. R.A. at 36-⁠39. The record contained no evidence that the Landlord ever offered to settle Ms. Charland’s attorney’s fees. R.A. at 33-⁠42.</w:t>
       </w:r>
     </w:p>
     <w:p>
@@ -7351,13 +7261,7 @@
         <w:t xml:space="preserve"> </w:t>
       </w:r>
       <w:r>
-        <w:t xml:space="preserve">nonetheless dictates that possession be awarded to Ms. Charland, even if the Landlord no longer owed money. R.A. at 36</w:t>
-      </w:r>
-      <w:r>
-        <w:noBreakHyphen/>
-      </w:r>
-      <w:r>
-        <w:t xml:space="preserve">37, 39. Attorney Farber admitted that there was no meeting of the minds, only a unilateral tender of funds. R.A. at 41. The Housing Court had the following exchange with Attorney Farber: THE COURT: And was there any - - Attorney Farber, is the argument that there was meeting of the minds on - - I understand your argument completely, which is you’ve evaporated the claim by settling its value by proffering and tendering those funds; but my question to you is is there correspondence between the parties to indicate that there was a quid pro quo other than what you believe is inherent in this that - - that they would hold - - settled that claim, that - - in full settlement?</w:t>
+        <w:t xml:space="preserve">nonetheless dictates that possession be awarded to Ms. Charland, even if the Landlord no longer owed money. R.A. at 36-⁠37, 39. Attorney Farber admitted that there was no meeting of the minds, only a unilateral tender of funds. R.A. at 41. The Housing Court had the following exchange with Attorney Farber: THE COURT: And was there any - - Attorney Farber, is the argument that there was meeting of the minds on - - I understand your argument completely, which is you’ve evaporated the claim by settling its value by proffering and tendering those funds; but my question to you is is there correspondence between the parties to indicate that there was a quid pro quo other than what you believe is inherent in this that - - that they would hold - - settled that claim, that - - in full settlement?</w:t>
       </w:r>
     </w:p>
     <w:p>
@@ -7365,13 +7269,7 @@
         <w:pStyle w:val="BodyText"/>
       </w:pPr>
       <w:r>
-        <w:t xml:space="preserve">MR. FARBER: I don’t think there was ever stated [sic] in that kind of straightforward language, your Honor. R.A. at 41. The Landlord offered no affirmative, admissible proof of any agreement or waiver. R.A. at 32</w:t>
-      </w:r>
-      <w:r>
-        <w:noBreakHyphen/>
-      </w:r>
-      <w:r>
-        <w:t xml:space="preserve">59. Furthermore, Ms. Charland testified – and the Landlord acknowledged – that Ms. Charland was up to date with use and occupancy payments. R.A. at 40, 62.</w:t>
+        <w:t xml:space="preserve">MR. FARBER: I don’t think there was ever stated [sic] in that kind of straightforward language, your Honor. R.A. at 41. The Landlord offered no affirmative, admissible proof of any agreement or waiver. R.A. at 32-⁠59. Furthermore, Ms. Charland testified – and the Landlord acknowledged – that Ms. Charland was up to date with use and occupancy payments. R.A. at 40, 62.</w:t>
       </w:r>
     </w:p>
     <w:p>
@@ -7385,13 +7283,7 @@
         <w:t xml:space="preserve"> </w:t>
       </w:r>
       <w:r>
-        <w:t xml:space="preserve">R.A. at 26</w:t>
-      </w:r>
-      <w:r>
-        <w:noBreakHyphen/>
-      </w:r>
-      <w:r>
-        <w:t xml:space="preserve">27. On August 30, 2021, the Housing Court entered judgment for the Landlord. R.A. at 7. This appeal follows.</w:t>
+        <w:t xml:space="preserve">R.A. at 26-⁠27. On August 30, 2021, the Housing Court entered judgment for the Landlord. R.A. at 7. This appeal follows.</w:t>
       </w:r>
     </w:p>
     <w:p>
@@ -8789,13 +8681,7 @@
         <w:t xml:space="preserve">v. Norat-Reyes</w:t>
       </w:r>
       <w:r>
-        <w:t xml:space="preserve">, 17-SP</w:t>
-      </w:r>
-      <w:r>
-        <w:noBreakHyphen/>
-      </w:r>
-      <w:r>
-        <w:t xml:space="preserve">181, March 1, 2017 (Housing Ct., Western Div.) (Fields, J.) (holding that return of the security deposit upon demand prevents the tenant from claiming a violation and damages under G. L. c.186, §15B,</w:t>
+        <w:t xml:space="preserve">, 17-SP-⁠181, March 1, 2017 (Housing Ct., Western Div.) (Fields, J.) (holding that return of the security deposit upon demand prevents the tenant from claiming a violation and damages under G. L. c.186, §15B,</w:t>
       </w:r>
       <w:r>
         <w:t xml:space="preserve"> </w:t>
@@ -9327,13 +9213,7 @@
         <w:t xml:space="preserve">LLP v. Sterling Lion, LLC</w:t>
       </w:r>
       <w:r>
-        <w:t xml:space="preserve">, 91 Mass.App.Ct. 114, 118</w:t>
-      </w:r>
-      <w:r>
-        <w:noBreakHyphen/>
-      </w:r>
-      <w:r>
-        <w:t xml:space="preserve">119, 71 N.E.3d 171 (2017). In short, even if the amount of damages has been resolved and accounted for, judgment on the legal claim still enters. Where an entry of judgment for a party results in further available relief – like the availability of possession in an eviction case – this distinction matters.</w:t>
+        <w:t xml:space="preserve">, 91 Mass.App.Ct. 114, 118-⁠119, 71 N.E.3d 171 (2017). In short, even if the amount of damages has been resolved and accounted for, judgment on the legal claim still enters. Where an entry of judgment for a party results in further available relief – like the availability of possession in an eviction case – this distinction matters.</w:t>
       </w:r>
     </w:p>
     <w:p>
@@ -9465,13 +9345,7 @@
         <w:t xml:space="preserve">Corp. v. Symczyk</w:t>
       </w:r>
       <w:r>
-        <w:t xml:space="preserve">, 569 U.S. 66, 81, 133 S.Ct. 1523, 1533</w:t>
-      </w:r>
-      <w:r>
-        <w:noBreakHyphen/>
-      </w:r>
-      <w:r>
-        <w:t xml:space="preserve">34 (2013) (Kagan, dissenting).</w:t>
+        <w:t xml:space="preserve">, 569 U.S. 66, 81, 133 S.Ct. 1523, 1533-⁠34 (2013) (Kagan, dissenting).</w:t>
       </w:r>
     </w:p>
     <w:p>
@@ -9491,13 +9365,7 @@
         <w:t xml:space="preserve"> </w:t>
       </w:r>
       <w:r>
-        <w:t xml:space="preserve">In addition, nothing in the record suggests that the Landlord’s offer included payment of attorney’s fees, and therefore, there was not complete monetary relief. R.A. at 33</w:t>
-      </w:r>
-      <w:r>
-        <w:noBreakHyphen/>
-      </w:r>
-      <w:r>
-        <w:t xml:space="preserve">42.</w:t>
+        <w:t xml:space="preserve">In addition, nothing in the record suggests that the Landlord’s offer included payment of attorney’s fees, and therefore, there was not complete monetary relief. R.A. at 33-⁠42.</w:t>
       </w:r>
     </w:p>
     <w:p>
@@ -10975,13 +10843,7 @@
         <w:t xml:space="preserve"> </w:t>
       </w:r>
       <w:r>
-        <w:t xml:space="preserve">and that mere tender of payment did not change that entitlement. R.A. at 34</w:t>
-      </w:r>
-      <w:r>
-        <w:noBreakHyphen/>
-      </w:r>
-      <w:r>
-        <w:t xml:space="preserve">39. Nowhere in the record from the June 21, 2021 trial was any affirmative and admissible evidence offered to support the Housing Court’s conclusion that Ms. Charland waived any claim or defense. Therefore, the Housing Court abused it’s discretion by forming a conclusion that Ms. Charland waived or relinquished her claim or defense.</w:t>
+        <w:t xml:space="preserve">and that mere tender of payment did not change that entitlement. R.A. at 34-⁠39. Nowhere in the record from the June 21, 2021 trial was any affirmative and admissible evidence offered to support the Housing Court’s conclusion that Ms. Charland waived any claim or defense. Therefore, the Housing Court abused it’s discretion by forming a conclusion that Ms. Charland waived or relinquished her claim or defense.</w:t>
       </w:r>
     </w:p>
     <w:p>
@@ -11547,13 +11409,7 @@
         <w:pStyle w:val="BodyText"/>
       </w:pPr>
       <w:r>
-        <w:t xml:space="preserve">Here, the record contains no evidence to suggest that the parties entered into the requisite accord that could be satisfied by payment afterward. R.A. at 32</w:t>
-      </w:r>
-      <w:r>
-        <w:noBreakHyphen/>
-      </w:r>
-      <w:r>
-        <w:t xml:space="preserve">43. The defense of accord and satisfaction does not apply to this case and, therefore, Ms. Charland did not surrender her claim under §22</w:t>
+        <w:t xml:space="preserve">Here, the record contains no evidence to suggest that the parties entered into the requisite accord that could be satisfied by payment afterward. R.A. at 32-⁠43. The defense of accord and satisfaction does not apply to this case and, therefore, Ms. Charland did not surrender her claim under §22</w:t>
       </w:r>
       <w:r>
         <w:t xml:space="preserve"> </w:t>
@@ -11872,9 +11728,7 @@
               <w:t xml:space="preserve"> </w:t>
             </w:r>
             <w:r>
-              <w:t xml:space="preserve">(413)686</w:t>
-              <w:noBreakHyphen/>
-              <w:t xml:space="preserve">9007</w:t>
+              <w:t xml:space="preserve">(413)686-⁠9007</w:t>
             </w:r>
             <w:r>
               <w:t xml:space="preserve"> </w:t>
@@ -11886,9 +11740,7 @@
               <w:t xml:space="preserve"> </w:t>
             </w:r>
             <w:r>
-              <w:t xml:space="preserve">(413)746</w:t>
-              <w:noBreakHyphen/>
-              <w:t xml:space="preserve">3221</w:t>
+              <w:t xml:space="preserve">(413)746-⁠3221</w:t>
             </w:r>
           </w:p>
           <w:p>
@@ -11979,13 +11831,7 @@
         <w:pStyle w:val="XdTail"/>
       </w:pPr>
       <w:r>
-        <w:t xml:space="preserve">Docket from Case No. 20-SP</w:t>
-      </w:r>
-      <w:r>
-        <w:noBreakHyphen/>
-      </w:r>
-      <w:r>
-        <w:t xml:space="preserve">1676 (August 30, 2021 Entry of Judgment)</w:t>
+        <w:t xml:space="preserve">Docket from Case No. 20-SP-⁠1676 (August 30, 2021 Entry of Judgment)</w:t>
       </w:r>
     </w:p>
     <w:p>
@@ -12038,13 +11884,7 @@
         <w:t xml:space="preserve">v. Norat-Reyes</w:t>
       </w:r>
       <w:r>
-        <w:t xml:space="preserve">, 17-SP</w:t>
-      </w:r>
-      <w:r>
-        <w:noBreakHyphen/>
-      </w:r>
-      <w:r>
-        <w:t xml:space="preserve">181, March 1, 2017</w:t>
+        <w:t xml:space="preserve">, 17-SP-⁠181, March 1, 2017</w:t>
       </w:r>
     </w:p>
     <w:p>
@@ -12170,13 +12010,7 @@
         <w:pStyle w:val="XdTail"/>
       </w:pPr>
       <w:r>
-        <w:t xml:space="preserve">CASE NO. 20-SP</w:t>
-      </w:r>
-      <w:r>
-        <w:noBreakHyphen/>
-      </w:r>
-      <w:r>
-        <w:t xml:space="preserve">1676</w:t>
+        <w:t xml:space="preserve">CASE NO. 20-SP-⁠1676</w:t>
       </w:r>
     </w:p>
     <w:p>
@@ -12389,9 +12223,7 @@
           <w:b/>
           <w:bCs/>
         </w:rPr>
-        <w:t xml:space="preserve">20-SP</w:t>
-        <w:noBreakHyphen/>
-        <w:t xml:space="preserve">1676</w:t>
+        <w:t xml:space="preserve">20-SP-⁠1676</w:t>
       </w:r>
       <w:r>
         <w:rPr>
@@ -12499,19 +12331,7 @@
         <w:pStyle w:val="XdTail"/>
       </w:pPr>
       <w:r>
-        <w:t xml:space="preserve">Party Attorney: Attorney Farber, Esq., Lawrence J. Bar Code 547966. Address: Farber and Lindley LLC, 30 Boltwood Walk Suite 101, Amherst, MA 01002. Phone Number (413)256</w:t>
-      </w:r>
-      <w:r>
-        <w:noBreakHyphen/>
-      </w:r>
-      <w:r>
-        <w:t xml:space="preserve">8429. Party Attorney: Attorney Fonseca, Esq., Gabriel. Bar Code 706870. Address: Community Legal Aid, 1 Monarch Place Suite 400, Springfield, MA 01144. Phone Number (413)686</w:t>
-      </w:r>
-      <w:r>
-        <w:noBreakHyphen/>
-      </w:r>
-      <w:r>
-        <w:t xml:space="preserve">9007. Party Attorney: Pro Se. Bar Code PROPER.</w:t>
+        <w:t xml:space="preserve">Party Attorney: Attorney Farber, Esq., Lawrence J. Bar Code 547966. Address: Farber and Lindley LLC, 30 Boltwood Walk Suite 101, Amherst, MA 01002. Phone Number (413)256-⁠8429. Party Attorney: Attorney Fonseca, Esq., Gabriel. Bar Code 706870. Address: Community Legal Aid, 1 Monarch Place Suite 400, Springfield, MA 01144. Phone Number (413)686-⁠9007. Party Attorney: Pro Se. Bar Code PROPER.</w:t>
       </w:r>
     </w:p>
     <w:p>
@@ -12615,19 +12435,7 @@
         <w:pStyle w:val="XdTail"/>
       </w:pPr>
       <w:r>
-        <w:t xml:space="preserve">01/05/2021 The following court event has been scheduled: 03/05/2021 09:00 AM Status Hearing. The event will be held via Video Conference and the virtual conference information is Mtg ID: 161 638 3742 Pwd: 1234 Tel# 646</w:t>
-      </w:r>
-      <w:r>
-        <w:noBreakHyphen/>
-      </w:r>
-      <w:r>
-        <w:t xml:space="preserve">828</w:t>
-      </w:r>
-      <w:r>
-        <w:noBreakHyphen/>
-      </w:r>
-      <w:r>
-        <w:t xml:space="preserve">7666.</w:t>
+        <w:t xml:space="preserve">01/05/2021 The following court event has been scheduled: 03/05/2021 09:00 AM Status Hearing. The event will be held via Video Conference and the virtual conference information is Mtg ID: 161 638 3742 Pwd: 1234 Tel# 646-⁠828-⁠7666.</w:t>
       </w:r>
     </w:p>
     <w:p>
@@ -12715,19 +12523,7 @@
         <w:pStyle w:val="XdTail"/>
       </w:pPr>
       <w:r>
-        <w:t xml:space="preserve">03/09/2021 The following court event has been scheduled: 03/17/2021 09:00 AM Housing Specialist Mediation. The event will be held via video conference and the virtual conference information is: Mtg ID: 161 638 3742 Pwd: 1234 Tel# 646</w:t>
-      </w:r>
-      <w:r>
-        <w:noBreakHyphen/>
-      </w:r>
-      <w:r>
-        <w:t xml:space="preserve">828</w:t>
-      </w:r>
-      <w:r>
-        <w:noBreakHyphen/>
-      </w:r>
-      <w:r>
-        <w:t xml:space="preserve">7666.</w:t>
+        <w:t xml:space="preserve">03/09/2021 The following court event has been scheduled: 03/17/2021 09:00 AM Housing Specialist Mediation. The event will be held via video conference and the virtual conference information is: Mtg ID: 161 638 3742 Pwd: 1234 Tel# 646-⁠828-⁠7666.</w:t>
       </w:r>
     </w:p>
     <w:p>
@@ -12879,19 +12675,7 @@
         <w:pStyle w:val="XdTail"/>
       </w:pPr>
       <w:r>
-        <w:t xml:space="preserve">05/11/2021 The following court event has been scheduled: 06/21/2021 10:00 AM Summary Process Trial. The event will be held via video conference and the conference information is Mtg ID: 161 638 3742 Pwd: 1234 Tel# 646</w:t>
-      </w:r>
-      <w:r>
-        <w:noBreakHyphen/>
-      </w:r>
-      <w:r>
-        <w:t xml:space="preserve">828</w:t>
-      </w:r>
-      <w:r>
-        <w:noBreakHyphen/>
-      </w:r>
-      <w:r>
-        <w:t xml:space="preserve">7666. Judge: Fields, Hon. Robert G.</w:t>
+        <w:t xml:space="preserve">05/11/2021 The following court event has been scheduled: 06/21/2021 10:00 AM Summary Process Trial. The event will be held via video conference and the conference information is Mtg ID: 161 638 3742 Pwd: 1234 Tel# 646-⁠828-⁠7666. Judge: Fields, Hon. Robert G.</w:t>
       </w:r>
     </w:p>
     <w:p>
@@ -12907,19 +12691,7 @@
         <w:pStyle w:val="XdTail"/>
       </w:pPr>
       <w:r>
-        <w:t xml:space="preserve">05/11/2021 The following court event has been scheduled: 06/17/2021 02:00 PM Housing Specialist Mediation. The event will be held via video conference and the conference information is Mtg ID: 161 638 3742 Pwd: 1234 Tel# 646</w:t>
-      </w:r>
-      <w:r>
-        <w:noBreakHyphen/>
-      </w:r>
-      <w:r>
-        <w:t xml:space="preserve">828</w:t>
-      </w:r>
-      <w:r>
-        <w:noBreakHyphen/>
-      </w:r>
-      <w:r>
-        <w:t xml:space="preserve">7666.</w:t>
+        <w:t xml:space="preserve">05/11/2021 The following court event has been scheduled: 06/17/2021 02:00 PM Housing Specialist Mediation. The event will be held via video conference and the conference information is Mtg ID: 161 638 3742 Pwd: 1234 Tel# 646-⁠828-⁠7666.</w:t>
       </w:r>
     </w:p>
     <w:p>
@@ -13039,19 +12811,7 @@
         <w:pStyle w:val="XdTail"/>
       </w:pPr>
       <w:r>
-        <w:t xml:space="preserve">08/24/2021 The following court event has been scheduled: 08/26/2021 11:00 AM Motion Hearing. The event will be held via video conference and the conference information is Mtg ID: 161 638 3742 Pwd: 1234 Tel# 646</w:t>
-      </w:r>
-      <w:r>
-        <w:noBreakHyphen/>
-      </w:r>
-      <w:r>
-        <w:t xml:space="preserve">828</w:t>
-      </w:r>
-      <w:r>
-        <w:noBreakHyphen/>
-      </w:r>
-      <w:r>
-        <w:t xml:space="preserve">7666.</w:t>
+        <w:t xml:space="preserve">08/24/2021 The following court event has been scheduled: 08/26/2021 11:00 AM Motion Hearing. The event will be held via video conference and the conference information is Mtg ID: 161 638 3742 Pwd: 1234 Tel# 646-⁠828-⁠7666.</w:t>
       </w:r>
     </w:p>
     <w:p>
@@ -13123,19 +12883,7 @@
         <w:pStyle w:val="XdTail"/>
       </w:pPr>
       <w:r>
-        <w:t xml:space="preserve">10/06/2021 The following court event has been scheduled: 10/07/2021 09:00 AM Hearing. The event will be held via video conference and the conference information is Mtg ID: 161 638 3742 Pwd: 1234 Tel# 646</w:t>
-      </w:r>
-      <w:r>
-        <w:noBreakHyphen/>
-      </w:r>
-      <w:r>
-        <w:t xml:space="preserve">828</w:t>
-      </w:r>
-      <w:r>
-        <w:noBreakHyphen/>
-      </w:r>
-      <w:r>
-        <w:t xml:space="preserve">7666. Hearing on motion to set or waive appeal bond.</w:t>
+        <w:t xml:space="preserve">10/06/2021 The following court event has been scheduled: 10/07/2021 09:00 AM Hearing. The event will be held via video conference and the conference information is Mtg ID: 161 638 3742 Pwd: 1234 Tel# 646-⁠828-⁠7666. Hearing on motion to set or waive appeal bond.</w:t>
       </w:r>
     </w:p>
     <w:p>
@@ -13183,19 +12931,7 @@
         <w:pStyle w:val="XdTail"/>
       </w:pPr>
       <w:r>
-        <w:t xml:space="preserve">10/07/2021 The following court event has been scheduled: 10/13/2021 09:00 AM Hearing. The event will be held via video conference and the conference information is Mtg ID: 161 638 3742 Pwd: 1234 Tel# 646</w:t>
-      </w:r>
-      <w:r>
-        <w:noBreakHyphen/>
-      </w:r>
-      <w:r>
-        <w:t xml:space="preserve">828</w:t>
-      </w:r>
-      <w:r>
-        <w:noBreakHyphen/>
-      </w:r>
-      <w:r>
-        <w:t xml:space="preserve">7666.</w:t>
+        <w:t xml:space="preserve">10/07/2021 The following court event has been scheduled: 10/13/2021 09:00 AM Hearing. The event will be held via video conference and the conference information is Mtg ID: 161 638 3742 Pwd: 1234 Tel# 646-⁠828-⁠7666.</w:t>
       </w:r>
     </w:p>
     <w:p>
@@ -13235,19 +12971,7 @@
         <w:pStyle w:val="XdTail"/>
       </w:pPr>
       <w:r>
-        <w:t xml:space="preserve">03/16/2022 Transcript of 6</w:t>
-      </w:r>
-      <w:r>
-        <w:noBreakHyphen/>
-      </w:r>
-      <w:r>
-        <w:t xml:space="preserve">21</w:t>
-      </w:r>
-      <w:r>
-        <w:noBreakHyphen/>
-      </w:r>
-      <w:r>
-        <w:t xml:space="preserve">21 hearing filed by Laural Charland (Ref. 39).</w:t>
+        <w:t xml:space="preserve">03/16/2022 Transcript of 6-⁠21-⁠21 hearing filed by Laural Charland (Ref. 39).</w:t>
       </w:r>
     </w:p>
     <w:p>
@@ -13345,13 +13069,7 @@
         <w:pStyle w:val="XdTail"/>
       </w:pPr>
       <w:r>
-        <w:t xml:space="preserve">&lt;Section impacted by 2020, 65, Secs. 3, 4 and 6 effective April 20, 2020 relating to lessor accessing rent received in advance for the last month of tenancy in order to address disruptions caused by the outbreak of COVID</w:t>
-      </w:r>
-      <w:r>
-        <w:noBreakHyphen/>
-      </w:r>
-      <w:r>
-        <w:t xml:space="preserve">19.&gt;</w:t>
+        <w:t xml:space="preserve">&lt;Section impacted by 2020, 65, Secs. 3, 4 and 6 effective April 20, 2020 relating to lessor accessing rent received in advance for the last month of tenancy in order to address disruptions caused by the outbreak of COVID-⁠19.&gt;</w:t>
       </w:r>
     </w:p>
     <w:p>
@@ -13672,13 +13390,7 @@
         <w:pStyle w:val="XdTail"/>
       </w:pPr>
       <w:r>
-        <w:t xml:space="preserve">&lt;Section impacted by 2020, 65, Secs. 3 and 6 effective April 20, 2020 relating to suspension of evictions in order to address disruptions caused by the outbreak of COVID</w:t>
-      </w:r>
-      <w:r>
-        <w:noBreakHyphen/>
-      </w:r>
-      <w:r>
-        <w:t xml:space="preserve">19.&gt;</w:t>
+        <w:t xml:space="preserve">&lt;Section impacted by 2020, 65, Secs. 3 and 6 effective April 20, 2020 relating to suspension of evictions in order to address disruptions caused by the outbreak of COVID-⁠19.&gt;</w:t>
       </w:r>
     </w:p>
     <w:p>
@@ -14001,13 +13713,7 @@
         <w:pStyle w:val="XdTail"/>
       </w:pPr>
       <w:r>
-        <w:t xml:space="preserve">&lt;Section impacted by 2020, 65, Secs. 3 and 6 effective April 20, 2020 and 2020, 257, Sec. 1, as amended by 2021, 20, Secs. 12 to 15, 29 and 30 and 2022, 42, Sec. 30 effective December 31, 2020 relating to eviction protections in order to address disruptions caused by the outbreak of COVID</w:t>
-      </w:r>
-      <w:r>
-        <w:noBreakHyphen/>
-      </w:r>
-      <w:r>
-        <w:t xml:space="preserve">19.&gt;</w:t>
+        <w:t xml:space="preserve">&lt;Section impacted by 2020, 65, Secs. 3 and 6 effective April 20, 2020 and 2020, 257, Sec. 1, as amended by 2021, 20, Secs. 12 to 15, 29 and 30 and 2022, 42, Sec. 30 effective December 31, 2020 relating to eviction protections in order to address disruptions caused by the outbreak of COVID-⁠19.&gt;</w:t>
       </w:r>
     </w:p>
     <w:p>
@@ -14138,9 +13844,7 @@
           <w:b/>
           <w:bCs/>
         </w:rPr>
-        <w:t xml:space="preserve">17-SP</w:t>
-        <w:noBreakHyphen/>
-        <w:t xml:space="preserve">181,</w:t>
+        <w:t xml:space="preserve">17-SP-⁠181,</w:t>
       </w:r>
       <w:r>
         <w:rPr>
@@ -14190,13 +13894,7 @@
         <w:pStyle w:val="XdTail"/>
       </w:pPr>
       <w:r>
-        <w:t xml:space="preserve">Docket No.: 17-SP</w:t>
-      </w:r>
-      <w:r>
-        <w:noBreakHyphen/>
-      </w:r>
-      <w:r>
-        <w:t xml:space="preserve">181. Parties: PEDRO CRUZ, Plaintiff, v. VILMARY NORAT-REYES and SALVADOR MORENO, Defendants. Judge: ⁠/s/​Robert Fields, Associate Justice. Date: March 1, 2017. Western Division.</w:t>
+        <w:t xml:space="preserve">Docket No.: 17-SP-⁠181. Parties: PEDRO CRUZ, Plaintiff, v. VILMARY NORAT-REYES and SALVADOR MORENO, Defendants. Judge: ⁠/s/​Robert Fields, Associate Justice. Date: March 1, 2017. Western Division.</w:t>
       </w:r>
     </w:p>
     <w:p>
@@ -15223,9 +14921,7 @@
               <w:t xml:space="preserve"> </w:t>
             </w:r>
             <w:r>
-              <w:t xml:space="preserve">(413)686</w:t>
-              <w:noBreakHyphen/>
-              <w:t xml:space="preserve">9007</w:t>
+              <w:t xml:space="preserve">(413)686-⁠9007</w:t>
             </w:r>
             <w:r>
               <w:t xml:space="preserve"> </w:t>
@@ -15237,9 +14933,7 @@
               <w:t xml:space="preserve"> </w:t>
             </w:r>
             <w:r>
-              <w:t xml:space="preserve">(413)746</w:t>
-              <w:noBreakHyphen/>
-              <w:t xml:space="preserve">3221</w:t>
+              <w:t xml:space="preserve">(413)746-⁠3221</w:t>
             </w:r>
           </w:p>
           <w:p>
@@ -15485,9 +15179,7 @@
               <w:t xml:space="preserve"> </w:t>
             </w:r>
             <w:r>
-              <w:t xml:space="preserve">2022-P</w:t>
-              <w:noBreakHyphen/>
-              <w:t xml:space="preserve">0300,</w:t>
+              <w:t xml:space="preserve">2022-P-⁠0300,</w:t>
             </w:r>
             <w:r>
               <w:t xml:space="preserve"> </w:t>
@@ -15992,9 +15684,7 @@
               <w:t xml:space="preserve"> </w:t>
             </w:r>
             <w:r>
-              <w:t xml:space="preserve">(413)686</w:t>
-              <w:noBreakHyphen/>
-              <w:t xml:space="preserve">9007</w:t>
+              <w:t xml:space="preserve">(413)686-⁠9007</w:t>
             </w:r>
             <w:r>
               <w:t xml:space="preserve"> </w:t>
@@ -16006,9 +15696,7 @@
               <w:t xml:space="preserve"> </w:t>
             </w:r>
             <w:r>
-              <w:t xml:space="preserve">(413)746</w:t>
-              <w:noBreakHyphen/>
-              <w:t xml:space="preserve">3221</w:t>
+              <w:t xml:space="preserve">(413)746-⁠3221</w:t>
             </w:r>
           </w:p>
           <w:p>

</xml_diff>